<commit_message>
removed outer shadow from tab-items, added another video for the game, renamed some files
</commit_message>
<xml_diff>
--- a/assets/docs/Rasha Alsaleh.docx
+++ b/assets/docs/Rasha Alsaleh.docx
@@ -59,25 +59,7 @@
         <w:rPr>
           <w:rFonts w:asciiTheme="majorBidi" w:hAnsiTheme="majorBidi" w:cstheme="majorBidi"/>
         </w:rPr>
-        <w:t>Amman, Jordan</w:t>
-      </w:r>
-      <w:r>
-        <w:rPr>
-          <w:rFonts w:asciiTheme="majorBidi" w:hAnsiTheme="majorBidi" w:cstheme="majorBidi"/>
-        </w:rPr>
-        <w:t xml:space="preserve"> | </w:t>
-      </w:r>
-      <w:r>
-        <w:rPr>
-          <w:rFonts w:asciiTheme="majorBidi" w:hAnsiTheme="majorBidi" w:cstheme="majorBidi"/>
-        </w:rPr>
-        <w:t>+962 781277089</w:t>
-      </w:r>
-      <w:r>
-        <w:rPr>
-          <w:rFonts w:asciiTheme="majorBidi" w:hAnsiTheme="majorBidi" w:cstheme="majorBidi"/>
-        </w:rPr>
-        <w:t xml:space="preserve"> | </w:t>
+        <w:t xml:space="preserve">Amman, Jordan | +962 781277089 | </w:t>
       </w:r>
       <w:hyperlink r:id="rId6" w:history="1">
         <w:r>
@@ -92,13 +74,7 @@
         <w:rPr>
           <w:rFonts w:asciiTheme="majorBidi" w:hAnsiTheme="majorBidi" w:cstheme="majorBidi"/>
         </w:rPr>
-        <w:t xml:space="preserve"> | </w:t>
-      </w:r>
-      <w:r>
-        <w:rPr>
-          <w:rFonts w:asciiTheme="majorBidi" w:hAnsiTheme="majorBidi" w:cstheme="majorBidi"/>
-        </w:rPr>
-        <w:t xml:space="preserve"> LinkedIn: </w:t>
+        <w:t xml:space="preserve"> |  LinkedIn: </w:t>
       </w:r>
       <w:hyperlink r:id="rId7" w:history="1">
         <w:r>
@@ -113,13 +89,7 @@
         <w:rPr>
           <w:rFonts w:asciiTheme="majorBidi" w:hAnsiTheme="majorBidi" w:cstheme="majorBidi"/>
         </w:rPr>
-        <w:t xml:space="preserve"> | </w:t>
-      </w:r>
-      <w:r>
-        <w:rPr>
-          <w:rFonts w:asciiTheme="majorBidi" w:hAnsiTheme="majorBidi" w:cstheme="majorBidi"/>
-        </w:rPr>
-        <w:t xml:space="preserve">GitHub: </w:t>
+        <w:t xml:space="preserve"> | GitHub: </w:t>
       </w:r>
       <w:hyperlink r:id="rId8" w:history="1">
         <w:r>
@@ -127,21 +97,7 @@
             <w:rStyle w:val="Hyperlink"/>
             <w:rFonts w:asciiTheme="majorBidi" w:hAnsiTheme="majorBidi" w:cstheme="majorBidi"/>
           </w:rPr>
-          <w:t>@</w:t>
-        </w:r>
-        <w:r>
-          <w:rPr>
-            <w:rStyle w:val="Hyperlink"/>
-            <w:rFonts w:asciiTheme="majorBidi" w:hAnsiTheme="majorBidi" w:cstheme="majorBidi"/>
-          </w:rPr>
-          <w:t>rasha-2</w:t>
-        </w:r>
-        <w:r>
-          <w:rPr>
-            <w:rStyle w:val="Hyperlink"/>
-            <w:rFonts w:asciiTheme="majorBidi" w:hAnsiTheme="majorBidi" w:cstheme="majorBidi"/>
-          </w:rPr>
-          <w:t>k</w:t>
+          <w:t>@rasha-2k</w:t>
         </w:r>
       </w:hyperlink>
     </w:p>
@@ -192,23 +148,7 @@
           <w:sz w:val="28"/>
           <w:szCs w:val="28"/>
         </w:rPr>
-        <w:t>I am a passionate and driven software engineering student at Amman Arab University, currently in my third year. My journey in the tech world is fueled by a love for problem-solving, creativity, and continuous learning. I have actively participated in various competitions, earning accolades for my innovative ideas and technical skills. My focus is on mobile app development, where I am exploring cross-platform solutions using Flutter.</w:t>
-      </w:r>
-      <w:r>
-        <w:rPr>
-          <w:rFonts w:asciiTheme="majorBidi" w:hAnsiTheme="majorBidi" w:cstheme="majorBidi"/>
-          <w:sz w:val="28"/>
-          <w:szCs w:val="28"/>
-        </w:rPr>
-        <w:t xml:space="preserve"> </w:t>
-      </w:r>
-      <w:r>
-        <w:rPr>
-          <w:rFonts w:asciiTheme="majorBidi" w:hAnsiTheme="majorBidi" w:cstheme="majorBidi"/>
-          <w:sz w:val="28"/>
-          <w:szCs w:val="28"/>
-        </w:rPr>
-        <w:t>Additionally, I have a strong foundation in C++, Java, and C# with .NET.</w:t>
+        <w:t>I'm a driven software engineer with a deep passion for problem-solving, creativity, and continuous learning. With a focus on QA software testing, mobile app, and game development, I bring hands-on experience in C++, Java, and C#/.NET, along with growing expertise in Flutter and Dart for cross-platform mobile solutions. Recognized in several competitions for my innovative ideas and technical skills, I'm committed to delivering impactful, high-quality software solutions.</w:t>
       </w:r>
     </w:p>
     <w:p>
@@ -306,49 +246,15 @@
           <w:sz w:val="28"/>
           <w:szCs w:val="28"/>
         </w:rPr>
-        <w:t>B. Tech</w:t>
-      </w:r>
-      <w:r>
-        <w:rPr>
-          <w:rFonts w:asciiTheme="majorBidi" w:hAnsiTheme="majorBidi" w:cstheme="majorBidi"/>
-          <w:b/>
-          <w:bCs/>
-          <w:sz w:val="28"/>
-          <w:szCs w:val="28"/>
-        </w:rPr>
-        <w:t xml:space="preserve"> in Software Engineering</w:t>
-      </w:r>
-      <w:r>
-        <w:rPr>
-          <w:rFonts w:asciiTheme="majorBidi" w:hAnsiTheme="majorBidi" w:cstheme="majorBidi"/>
-          <w:sz w:val="28"/>
-          <w:szCs w:val="28"/>
-        </w:rPr>
-        <w:t xml:space="preserve"> </w:t>
-      </w:r>
-      <w:r>
-        <w:rPr>
-          <w:rFonts w:asciiTheme="majorBidi" w:hAnsiTheme="majorBidi" w:cstheme="majorBidi"/>
-          <w:sz w:val="28"/>
-          <w:szCs w:val="28"/>
-        </w:rPr>
-        <w:t xml:space="preserve">[2022 – </w:t>
-      </w:r>
-      <w:r>
-        <w:rPr>
-          <w:rFonts w:asciiTheme="majorBidi" w:hAnsiTheme="majorBidi" w:cstheme="majorBidi"/>
-          <w:sz w:val="28"/>
-          <w:szCs w:val="28"/>
-        </w:rPr>
-        <w:t>2026</w:t>
-      </w:r>
-      <w:r>
-        <w:rPr>
-          <w:rFonts w:asciiTheme="majorBidi" w:hAnsiTheme="majorBidi" w:cstheme="majorBidi"/>
-          <w:sz w:val="28"/>
-          <w:szCs w:val="28"/>
-        </w:rPr>
-        <w:t>]</w:t>
+        <w:t>B. Tech in Software Engineering</w:t>
+      </w:r>
+      <w:r>
+        <w:rPr>
+          <w:rFonts w:asciiTheme="majorBidi" w:hAnsiTheme="majorBidi" w:cstheme="majorBidi"/>
+          <w:sz w:val="28"/>
+          <w:szCs w:val="28"/>
+        </w:rPr>
+        <w:t xml:space="preserve"> [2022 – 2026]</w:t>
       </w:r>
     </w:p>
     <w:p>
@@ -377,17 +283,7 @@
           <w:sz w:val="32"/>
           <w:szCs w:val="32"/>
         </w:rPr>
-        <w:t>Certificat</w:t>
-      </w:r>
-      <w:r>
-        <w:rPr>
-          <w:rFonts w:asciiTheme="majorBidi" w:hAnsiTheme="majorBidi" w:cstheme="majorBidi"/>
-          <w:b/>
-          <w:bCs/>
-          <w:sz w:val="32"/>
-          <w:szCs w:val="32"/>
-        </w:rPr>
-        <w:t>es</w:t>
+        <w:t>Certificates</w:t>
       </w:r>
     </w:p>
     <w:p>
@@ -418,25 +314,15 @@
           <w:sz w:val="28"/>
           <w:szCs w:val="28"/>
         </w:rPr>
-        <w:t>PMI-ACP Exam Prep Course</w:t>
-      </w:r>
-      <w:r>
-        <w:rPr>
-          <w:rFonts w:asciiTheme="majorBidi" w:hAnsiTheme="majorBidi" w:cstheme="majorBidi"/>
-          <w:b/>
-          <w:bCs/>
-          <w:sz w:val="28"/>
-          <w:szCs w:val="28"/>
-        </w:rPr>
-        <w:t xml:space="preserve"> - </w:t>
-      </w:r>
-      <w:r>
-        <w:rPr>
-          <w:rFonts w:asciiTheme="majorBidi" w:hAnsiTheme="majorBidi" w:cstheme="majorBidi"/>
-          <w:sz w:val="28"/>
-          <w:szCs w:val="28"/>
-        </w:rPr>
-        <w:t>Udemy</w:t>
+        <w:t xml:space="preserve">QA Software Testing Course - </w:t>
+      </w:r>
+      <w:r>
+        <w:rPr>
+          <w:rFonts w:asciiTheme="majorBidi" w:hAnsiTheme="majorBidi" w:cstheme="majorBidi"/>
+          <w:sz w:val="28"/>
+          <w:szCs w:val="28"/>
+        </w:rPr>
+        <w:t xml:space="preserve">The Hope International, 40 Training hours </w:t>
       </w:r>
     </w:p>
     <w:p>
@@ -467,33 +353,15 @@
           <w:sz w:val="28"/>
           <w:szCs w:val="28"/>
         </w:rPr>
-        <w:t>QA Software Testing Cours</w:t>
-      </w:r>
-      <w:r>
-        <w:rPr>
-          <w:rFonts w:asciiTheme="majorBidi" w:hAnsiTheme="majorBidi" w:cstheme="majorBidi"/>
-          <w:b/>
-          <w:bCs/>
-          <w:sz w:val="28"/>
-          <w:szCs w:val="28"/>
-        </w:rPr>
-        <w:t xml:space="preserve">e - </w:t>
-      </w:r>
-      <w:r>
-        <w:rPr>
-          <w:rFonts w:asciiTheme="majorBidi" w:hAnsiTheme="majorBidi" w:cstheme="majorBidi"/>
-          <w:sz w:val="28"/>
-          <w:szCs w:val="28"/>
-        </w:rPr>
-        <w:t>The Hope International</w:t>
-      </w:r>
-      <w:r>
-        <w:rPr>
-          <w:rFonts w:asciiTheme="majorBidi" w:hAnsiTheme="majorBidi" w:cstheme="majorBidi"/>
-          <w:sz w:val="28"/>
-          <w:szCs w:val="28"/>
-        </w:rPr>
-        <w:t xml:space="preserve">, 40 Training hours </w:t>
+        <w:t xml:space="preserve">PMI-ACP Exam Prep Course - </w:t>
+      </w:r>
+      <w:r>
+        <w:rPr>
+          <w:rFonts w:asciiTheme="majorBidi" w:hAnsiTheme="majorBidi" w:cstheme="majorBidi"/>
+          <w:sz w:val="28"/>
+          <w:szCs w:val="28"/>
+        </w:rPr>
+        <w:t>Udemy</w:t>
       </w:r>
     </w:p>
     <w:p>
@@ -551,57 +419,41 @@
           <w:sz w:val="28"/>
           <w:szCs w:val="28"/>
         </w:rPr>
-        <w:t xml:space="preserve">AAU-PC 2023: </w:t>
-      </w:r>
-      <w:r>
-        <w:rPr>
-          <w:rFonts w:asciiTheme="majorBidi" w:hAnsiTheme="majorBidi" w:cstheme="majorBidi"/>
-          <w:sz w:val="28"/>
-          <w:szCs w:val="28"/>
-        </w:rPr>
-        <w:t>Ranked 4</w:t>
-      </w:r>
-      <w:r>
-        <w:rPr>
-          <w:rFonts w:asciiTheme="majorBidi" w:hAnsiTheme="majorBidi" w:cstheme="majorBidi"/>
-          <w:sz w:val="28"/>
-          <w:szCs w:val="28"/>
-          <w:vertAlign w:val="superscript"/>
-        </w:rPr>
-        <w:t>th</w:t>
-      </w:r>
-      <w:r>
-        <w:rPr>
-          <w:rFonts w:asciiTheme="majorBidi" w:hAnsiTheme="majorBidi" w:cstheme="majorBidi"/>
-          <w:sz w:val="28"/>
-          <w:szCs w:val="28"/>
-        </w:rPr>
-        <w:t xml:space="preserve"> place, 1</w:t>
-      </w:r>
-      <w:r>
-        <w:rPr>
-          <w:rFonts w:asciiTheme="majorBidi" w:hAnsiTheme="majorBidi" w:cstheme="majorBidi"/>
-          <w:sz w:val="28"/>
-          <w:szCs w:val="28"/>
-          <w:vertAlign w:val="superscript"/>
-        </w:rPr>
-        <w:t>st</w:t>
-      </w:r>
-      <w:r>
-        <w:rPr>
-          <w:rFonts w:asciiTheme="majorBidi" w:hAnsiTheme="majorBidi" w:cstheme="majorBidi"/>
-          <w:sz w:val="28"/>
-          <w:szCs w:val="28"/>
-        </w:rPr>
-        <w:t xml:space="preserve"> team to solve</w:t>
-      </w:r>
-      <w:r>
-        <w:rPr>
-          <w:rFonts w:asciiTheme="majorBidi" w:hAnsiTheme="majorBidi" w:cstheme="majorBidi"/>
-          <w:sz w:val="28"/>
-          <w:szCs w:val="28"/>
-        </w:rPr>
-        <w:t xml:space="preserve"> - </w:t>
+        <w:t>NASA Space Apps Challenge</w:t>
+      </w:r>
+      <w:r>
+        <w:rPr>
+          <w:rFonts w:asciiTheme="majorBidi" w:hAnsiTheme="majorBidi" w:cstheme="majorBidi"/>
+          <w:b/>
+          <w:bCs/>
+          <w:sz w:val="28"/>
+          <w:szCs w:val="28"/>
+        </w:rPr>
+        <w:t xml:space="preserve">: </w:t>
+      </w:r>
+      <w:r>
+        <w:rPr>
+          <w:rFonts w:asciiTheme="majorBidi" w:hAnsiTheme="majorBidi" w:cstheme="majorBidi"/>
+          <w:sz w:val="28"/>
+          <w:szCs w:val="28"/>
+        </w:rPr>
+        <w:t>The Creativity Award ||</w:t>
+      </w:r>
+      <w:r>
+        <w:rPr>
+          <w:rFonts w:asciiTheme="majorBidi" w:hAnsiTheme="majorBidi" w:cstheme="majorBidi"/>
+          <w:sz w:val="28"/>
+          <w:szCs w:val="28"/>
+        </w:rPr>
+        <w:t xml:space="preserve"> </w:t>
+      </w:r>
+      <w:r>
+        <w:rPr>
+          <w:rFonts w:asciiTheme="majorBidi" w:hAnsiTheme="majorBidi" w:cstheme="majorBidi"/>
+          <w:sz w:val="28"/>
+          <w:szCs w:val="28"/>
+        </w:rPr>
+        <w:t xml:space="preserve">By developing The Planetary Explorer Game - </w:t>
       </w:r>
       <w:r>
         <w:rPr>
@@ -609,7 +461,7 @@
           <w:sz w:val="24"/>
           <w:szCs w:val="24"/>
         </w:rPr>
-        <w:t>M</w:t>
+        <w:t>Oct</w:t>
       </w:r>
       <w:r>
         <w:rPr>
@@ -617,7 +469,15 @@
           <w:sz w:val="24"/>
           <w:szCs w:val="24"/>
         </w:rPr>
-        <w:t>ay 2023</w:t>
+        <w:t xml:space="preserve"> 202</w:t>
+      </w:r>
+      <w:r>
+        <w:rPr>
+          <w:rFonts w:asciiTheme="majorBidi" w:hAnsiTheme="majorBidi" w:cstheme="majorBidi"/>
+          <w:sz w:val="24"/>
+          <w:szCs w:val="24"/>
+        </w:rPr>
+        <w:t>4.</w:t>
       </w:r>
     </w:p>
     <w:p>
@@ -646,31 +506,35 @@
           <w:sz w:val="28"/>
           <w:szCs w:val="28"/>
         </w:rPr>
-        <w:t xml:space="preserve">JCPC23: </w:t>
-      </w:r>
-      <w:r>
-        <w:rPr>
-          <w:rFonts w:asciiTheme="majorBidi" w:hAnsiTheme="majorBidi" w:cstheme="majorBidi"/>
-          <w:sz w:val="28"/>
-          <w:szCs w:val="28"/>
-        </w:rPr>
-        <w:t>Participated in a re</w:t>
-      </w:r>
-      <w:r>
-        <w:rPr>
-          <w:rFonts w:asciiTheme="majorBidi" w:hAnsiTheme="majorBidi" w:cstheme="majorBidi"/>
-          <w:sz w:val="28"/>
-          <w:szCs w:val="28"/>
-        </w:rPr>
-        <w:t>gional programming competition</w:t>
-      </w:r>
-      <w:r>
-        <w:rPr>
-          <w:rFonts w:asciiTheme="majorBidi" w:hAnsiTheme="majorBidi" w:cstheme="majorBidi"/>
-          <w:sz w:val="28"/>
-          <w:szCs w:val="28"/>
-        </w:rPr>
-        <w:t xml:space="preserve"> - </w:t>
+        <w:t>AAU-PC 202</w:t>
+      </w:r>
+      <w:r>
+        <w:rPr>
+          <w:rFonts w:asciiTheme="majorBidi" w:hAnsiTheme="majorBidi" w:cstheme="majorBidi"/>
+          <w:b/>
+          <w:bCs/>
+          <w:sz w:val="28"/>
+          <w:szCs w:val="28"/>
+        </w:rPr>
+        <w:t>4</w:t>
+      </w:r>
+      <w:r>
+        <w:rPr>
+          <w:rFonts w:asciiTheme="majorBidi" w:hAnsiTheme="majorBidi" w:cstheme="majorBidi"/>
+          <w:b/>
+          <w:bCs/>
+          <w:sz w:val="28"/>
+          <w:szCs w:val="28"/>
+        </w:rPr>
+        <w:t xml:space="preserve">: </w:t>
+      </w:r>
+      <w:r>
+        <w:rPr>
+          <w:rFonts w:asciiTheme="majorBidi" w:hAnsiTheme="majorBidi" w:cstheme="majorBidi"/>
+          <w:sz w:val="28"/>
+          <w:szCs w:val="28"/>
+        </w:rPr>
+        <w:t xml:space="preserve">Participant - </w:t>
       </w:r>
       <w:r>
         <w:rPr>
@@ -678,7 +542,25 @@
           <w:sz w:val="24"/>
           <w:szCs w:val="24"/>
         </w:rPr>
-        <w:t>Nov 2023</w:t>
+        <w:t>May 202</w:t>
+      </w:r>
+      <w:r>
+        <w:rPr>
+          <w:rFonts w:asciiTheme="majorBidi" w:hAnsiTheme="majorBidi" w:cstheme="majorBidi"/>
+          <w:sz w:val="24"/>
+          <w:szCs w:val="24"/>
+        </w:rPr>
+        <w:t>4</w:t>
+      </w:r>
+      <w:r>
+        <w:rPr>
+          <w:rFonts w:asciiTheme="majorBidi" w:hAnsiTheme="majorBidi" w:cstheme="majorBidi"/>
+          <w:b/>
+          <w:bCs/>
+          <w:sz w:val="28"/>
+          <w:szCs w:val="28"/>
+        </w:rPr>
+        <w:t>.</w:t>
       </w:r>
     </w:p>
     <w:p>
@@ -707,23 +589,25 @@
           <w:sz w:val="28"/>
           <w:szCs w:val="28"/>
         </w:rPr>
-        <w:t xml:space="preserve">3Minutes Competition: </w:t>
-      </w:r>
-      <w:r>
-        <w:rPr>
-          <w:rFonts w:asciiTheme="majorBidi" w:hAnsiTheme="majorBidi" w:cstheme="majorBidi"/>
-          <w:sz w:val="28"/>
-          <w:szCs w:val="28"/>
-        </w:rPr>
-        <w:t xml:space="preserve">Ranked </w:t>
-      </w:r>
-      <w:r>
-        <w:rPr>
-          <w:rFonts w:asciiTheme="majorBidi" w:hAnsiTheme="majorBidi" w:cstheme="majorBidi"/>
-          <w:sz w:val="28"/>
-          <w:szCs w:val="28"/>
-        </w:rPr>
-        <w:t>3</w:t>
+        <w:t>AAU-XDT 2024:</w:t>
+      </w:r>
+      <w:r>
+        <w:rPr>
+          <w:rFonts w:asciiTheme="majorBidi" w:hAnsiTheme="majorBidi" w:cstheme="majorBidi"/>
+          <w:b/>
+          <w:bCs/>
+          <w:sz w:val="28"/>
+          <w:szCs w:val="28"/>
+        </w:rPr>
+        <w:t xml:space="preserve"> </w:t>
+      </w:r>
+      <w:r>
+        <w:rPr>
+          <w:rFonts w:asciiTheme="majorBidi" w:hAnsiTheme="majorBidi" w:cstheme="majorBidi"/>
+          <w:sz w:val="28"/>
+          <w:szCs w:val="28"/>
+        </w:rPr>
+        <w:t>2</w:t>
       </w:r>
       <w:r>
         <w:rPr>
@@ -732,23 +616,15 @@
           <w:szCs w:val="28"/>
           <w:vertAlign w:val="superscript"/>
         </w:rPr>
-        <w:t>rd</w:t>
-      </w:r>
-      <w:r>
-        <w:rPr>
-          <w:rFonts w:asciiTheme="majorBidi" w:hAnsiTheme="majorBidi" w:cstheme="majorBidi"/>
-          <w:sz w:val="28"/>
-          <w:szCs w:val="28"/>
-        </w:rPr>
-        <w:t xml:space="preserve"> place</w:t>
-      </w:r>
-      <w:r>
-        <w:rPr>
-          <w:rFonts w:asciiTheme="majorBidi" w:hAnsiTheme="majorBidi" w:cstheme="majorBidi"/>
-          <w:sz w:val="28"/>
-          <w:szCs w:val="28"/>
-        </w:rPr>
-        <w:t xml:space="preserve"> - </w:t>
+        <w:t>nd</w:t>
+      </w:r>
+      <w:r>
+        <w:rPr>
+          <w:rFonts w:asciiTheme="majorBidi" w:hAnsiTheme="majorBidi" w:cstheme="majorBidi"/>
+          <w:sz w:val="28"/>
+          <w:szCs w:val="28"/>
+        </w:rPr>
+        <w:t xml:space="preserve"> place || UI/UX design competition - </w:t>
       </w:r>
       <w:r>
         <w:rPr>
@@ -756,7 +632,15 @@
           <w:sz w:val="24"/>
           <w:szCs w:val="24"/>
         </w:rPr>
-        <w:t>Jan 2024</w:t>
+        <w:t>May 2024</w:t>
+      </w:r>
+      <w:r>
+        <w:rPr>
+          <w:rFonts w:asciiTheme="majorBidi" w:hAnsiTheme="majorBidi" w:cstheme="majorBidi"/>
+          <w:sz w:val="24"/>
+          <w:szCs w:val="24"/>
+        </w:rPr>
+        <w:t>.</w:t>
       </w:r>
     </w:p>
     <w:p>
@@ -769,43 +653,31 @@
         <w:tabs>
           <w:tab w:val="left" w:pos="1404"/>
         </w:tabs>
-        <w:spacing w:before="240" w:line="480" w:lineRule="auto"/>
+        <w:spacing w:before="240" w:line="276" w:lineRule="auto"/>
         <w:jc w:val="left"/>
         <w:rPr>
           <w:rFonts w:asciiTheme="majorBidi" w:hAnsiTheme="majorBidi" w:cstheme="majorBidi"/>
-          <w:b/>
-          <w:bCs/>
-          <w:sz w:val="28"/>
-          <w:szCs w:val="28"/>
-        </w:rPr>
-      </w:pPr>
-      <w:r>
-        <w:rPr>
-          <w:rFonts w:asciiTheme="majorBidi" w:hAnsiTheme="majorBidi" w:cstheme="majorBidi"/>
-          <w:b/>
-          <w:bCs/>
-          <w:sz w:val="28"/>
-          <w:szCs w:val="28"/>
-        </w:rPr>
-        <w:t>AAU-XDT 2024:</w:t>
-      </w:r>
-      <w:r>
-        <w:rPr>
-          <w:rFonts w:asciiTheme="majorBidi" w:hAnsiTheme="majorBidi" w:cstheme="majorBidi"/>
-          <w:b/>
-          <w:bCs/>
-          <w:sz w:val="28"/>
-          <w:szCs w:val="28"/>
-        </w:rPr>
-        <w:t xml:space="preserve"> </w:t>
-      </w:r>
-      <w:r>
-        <w:rPr>
-          <w:rFonts w:asciiTheme="majorBidi" w:hAnsiTheme="majorBidi" w:cstheme="majorBidi"/>
-          <w:sz w:val="28"/>
-          <w:szCs w:val="28"/>
-        </w:rPr>
-        <w:t>Ranked 2</w:t>
+          <w:sz w:val="28"/>
+          <w:szCs w:val="28"/>
+        </w:rPr>
+      </w:pPr>
+      <w:r>
+        <w:rPr>
+          <w:rFonts w:asciiTheme="majorBidi" w:hAnsiTheme="majorBidi" w:cstheme="majorBidi"/>
+          <w:b/>
+          <w:bCs/>
+          <w:sz w:val="28"/>
+          <w:szCs w:val="28"/>
+        </w:rPr>
+        <w:t xml:space="preserve">3Minutes Competition: </w:t>
+      </w:r>
+      <w:r>
+        <w:rPr>
+          <w:rFonts w:asciiTheme="majorBidi" w:hAnsiTheme="majorBidi" w:cstheme="majorBidi"/>
+          <w:sz w:val="28"/>
+          <w:szCs w:val="28"/>
+        </w:rPr>
+        <w:t>3</w:t>
       </w:r>
       <w:r>
         <w:rPr>
@@ -814,31 +686,41 @@
           <w:szCs w:val="28"/>
           <w:vertAlign w:val="superscript"/>
         </w:rPr>
-        <w:t>nd</w:t>
-      </w:r>
-      <w:r>
-        <w:rPr>
-          <w:rFonts w:asciiTheme="majorBidi" w:hAnsiTheme="majorBidi" w:cstheme="majorBidi"/>
-          <w:sz w:val="28"/>
-          <w:szCs w:val="28"/>
-        </w:rPr>
-        <w:t xml:space="preserve"> place </w:t>
-      </w:r>
-      <w:r>
-        <w:rPr>
-          <w:rFonts w:asciiTheme="majorBidi" w:hAnsiTheme="majorBidi" w:cstheme="majorBidi"/>
-          <w:sz w:val="28"/>
-          <w:szCs w:val="28"/>
-        </w:rPr>
-        <w:t>for UI/UX design competition</w:t>
-      </w:r>
-      <w:r>
-        <w:rPr>
-          <w:rFonts w:asciiTheme="majorBidi" w:hAnsiTheme="majorBidi" w:cstheme="majorBidi"/>
-          <w:sz w:val="28"/>
-          <w:szCs w:val="28"/>
-        </w:rPr>
-        <w:t xml:space="preserve"> - </w:t>
+        <w:t>rd</w:t>
+      </w:r>
+      <w:r>
+        <w:rPr>
+          <w:rFonts w:asciiTheme="majorBidi" w:hAnsiTheme="majorBidi" w:cstheme="majorBidi"/>
+          <w:sz w:val="28"/>
+          <w:szCs w:val="28"/>
+        </w:rPr>
+        <w:t xml:space="preserve"> place</w:t>
+      </w:r>
+      <w:r>
+        <w:rPr>
+          <w:rFonts w:asciiTheme="majorBidi" w:hAnsiTheme="majorBidi" w:cstheme="majorBidi"/>
+          <w:sz w:val="28"/>
+          <w:szCs w:val="28"/>
+        </w:rPr>
+        <w:t xml:space="preserve"> || By introducing </w:t>
+      </w:r>
+      <w:proofErr w:type="spellStart"/>
+      <w:r>
+        <w:rPr>
+          <w:rFonts w:asciiTheme="majorBidi" w:hAnsiTheme="majorBidi" w:cstheme="majorBidi"/>
+          <w:sz w:val="28"/>
+          <w:szCs w:val="28"/>
+        </w:rPr>
+        <w:t>UniBus</w:t>
+      </w:r>
+      <w:proofErr w:type="spellEnd"/>
+      <w:r>
+        <w:rPr>
+          <w:rFonts w:asciiTheme="majorBidi" w:hAnsiTheme="majorBidi" w:cstheme="majorBidi"/>
+          <w:sz w:val="28"/>
+          <w:szCs w:val="28"/>
+        </w:rPr>
+        <w:t xml:space="preserve"> project idea - </w:t>
       </w:r>
       <w:r>
         <w:rPr>
@@ -846,7 +728,231 @@
           <w:sz w:val="24"/>
           <w:szCs w:val="24"/>
         </w:rPr>
-        <w:t>May 2024</w:t>
+        <w:t>Jan 2024</w:t>
+      </w:r>
+      <w:r>
+        <w:rPr>
+          <w:rFonts w:asciiTheme="majorBidi" w:hAnsiTheme="majorBidi" w:cstheme="majorBidi"/>
+          <w:sz w:val="24"/>
+          <w:szCs w:val="24"/>
+        </w:rPr>
+        <w:t>.</w:t>
+      </w:r>
+    </w:p>
+    <w:p>
+      <w:pPr>
+        <w:pStyle w:val="ListParagraph"/>
+        <w:numPr>
+          <w:ilvl w:val="0"/>
+          <w:numId w:val="1"/>
+        </w:numPr>
+        <w:tabs>
+          <w:tab w:val="left" w:pos="1404"/>
+        </w:tabs>
+        <w:spacing w:before="240" w:line="276" w:lineRule="auto"/>
+        <w:jc w:val="left"/>
+        <w:rPr>
+          <w:rFonts w:asciiTheme="majorBidi" w:hAnsiTheme="majorBidi" w:cstheme="majorBidi"/>
+          <w:sz w:val="28"/>
+          <w:szCs w:val="28"/>
+        </w:rPr>
+      </w:pPr>
+      <w:r>
+        <w:rPr>
+          <w:rFonts w:asciiTheme="majorBidi" w:hAnsiTheme="majorBidi" w:cstheme="majorBidi"/>
+          <w:b/>
+          <w:bCs/>
+          <w:sz w:val="28"/>
+          <w:szCs w:val="28"/>
+        </w:rPr>
+        <w:t xml:space="preserve">JCPC23: </w:t>
+      </w:r>
+      <w:r>
+        <w:rPr>
+          <w:rFonts w:asciiTheme="majorBidi" w:hAnsiTheme="majorBidi" w:cstheme="majorBidi"/>
+          <w:sz w:val="28"/>
+          <w:szCs w:val="28"/>
+        </w:rPr>
+        <w:t xml:space="preserve">Participated in a regional programming competition - </w:t>
+      </w:r>
+      <w:r>
+        <w:rPr>
+          <w:rFonts w:asciiTheme="majorBidi" w:hAnsiTheme="majorBidi" w:cstheme="majorBidi"/>
+          <w:sz w:val="24"/>
+          <w:szCs w:val="24"/>
+        </w:rPr>
+        <w:t>Nov 2023.</w:t>
+      </w:r>
+    </w:p>
+    <w:p>
+      <w:pPr>
+        <w:pStyle w:val="ListParagraph"/>
+        <w:numPr>
+          <w:ilvl w:val="0"/>
+          <w:numId w:val="1"/>
+        </w:numPr>
+        <w:tabs>
+          <w:tab w:val="left" w:pos="1404"/>
+        </w:tabs>
+        <w:spacing w:before="240" w:line="276" w:lineRule="auto"/>
+        <w:jc w:val="left"/>
+        <w:rPr>
+          <w:rFonts w:asciiTheme="majorBidi" w:hAnsiTheme="majorBidi" w:cstheme="majorBidi"/>
+          <w:sz w:val="28"/>
+          <w:szCs w:val="28"/>
+        </w:rPr>
+      </w:pPr>
+      <w:r>
+        <w:rPr>
+          <w:rFonts w:asciiTheme="majorBidi" w:hAnsiTheme="majorBidi" w:cstheme="majorBidi"/>
+          <w:b/>
+          <w:bCs/>
+          <w:sz w:val="28"/>
+          <w:szCs w:val="28"/>
+        </w:rPr>
+        <w:t xml:space="preserve">AAU-PC 2023: </w:t>
+      </w:r>
+      <w:r>
+        <w:rPr>
+          <w:rFonts w:asciiTheme="majorBidi" w:hAnsiTheme="majorBidi" w:cstheme="majorBidi"/>
+          <w:sz w:val="28"/>
+          <w:szCs w:val="28"/>
+        </w:rPr>
+        <w:t>4</w:t>
+      </w:r>
+      <w:r>
+        <w:rPr>
+          <w:rFonts w:asciiTheme="majorBidi" w:hAnsiTheme="majorBidi" w:cstheme="majorBidi"/>
+          <w:sz w:val="28"/>
+          <w:szCs w:val="28"/>
+          <w:vertAlign w:val="superscript"/>
+        </w:rPr>
+        <w:t>th</w:t>
+      </w:r>
+      <w:r>
+        <w:rPr>
+          <w:rFonts w:asciiTheme="majorBidi" w:hAnsiTheme="majorBidi" w:cstheme="majorBidi"/>
+          <w:sz w:val="28"/>
+          <w:szCs w:val="28"/>
+        </w:rPr>
+        <w:t xml:space="preserve"> place</w:t>
+      </w:r>
+      <w:r>
+        <w:rPr>
+          <w:rFonts w:asciiTheme="majorBidi" w:hAnsiTheme="majorBidi" w:cstheme="majorBidi"/>
+          <w:sz w:val="28"/>
+          <w:szCs w:val="28"/>
+        </w:rPr>
+        <w:t xml:space="preserve"> ||</w:t>
+      </w:r>
+      <w:r>
+        <w:rPr>
+          <w:rFonts w:asciiTheme="majorBidi" w:hAnsiTheme="majorBidi" w:cstheme="majorBidi"/>
+          <w:sz w:val="28"/>
+          <w:szCs w:val="28"/>
+        </w:rPr>
+        <w:t xml:space="preserve"> 1</w:t>
+      </w:r>
+      <w:r>
+        <w:rPr>
+          <w:rFonts w:asciiTheme="majorBidi" w:hAnsiTheme="majorBidi" w:cstheme="majorBidi"/>
+          <w:sz w:val="28"/>
+          <w:szCs w:val="28"/>
+          <w:vertAlign w:val="superscript"/>
+        </w:rPr>
+        <w:t>st</w:t>
+      </w:r>
+      <w:r>
+        <w:rPr>
+          <w:rFonts w:asciiTheme="majorBidi" w:hAnsiTheme="majorBidi" w:cstheme="majorBidi"/>
+          <w:sz w:val="28"/>
+          <w:szCs w:val="28"/>
+        </w:rPr>
+        <w:t xml:space="preserve"> </w:t>
+      </w:r>
+      <w:r>
+        <w:rPr>
+          <w:rFonts w:asciiTheme="majorBidi" w:hAnsiTheme="majorBidi" w:cstheme="majorBidi"/>
+          <w:sz w:val="28"/>
+          <w:szCs w:val="28"/>
+        </w:rPr>
+        <w:t>T</w:t>
+      </w:r>
+      <w:r>
+        <w:rPr>
+          <w:rFonts w:asciiTheme="majorBidi" w:hAnsiTheme="majorBidi" w:cstheme="majorBidi"/>
+          <w:sz w:val="28"/>
+          <w:szCs w:val="28"/>
+        </w:rPr>
+        <w:t xml:space="preserve">eam </w:t>
+      </w:r>
+      <w:proofErr w:type="gramStart"/>
+      <w:r>
+        <w:rPr>
+          <w:rFonts w:asciiTheme="majorBidi" w:hAnsiTheme="majorBidi" w:cstheme="majorBidi"/>
+          <w:sz w:val="28"/>
+          <w:szCs w:val="28"/>
+        </w:rPr>
+        <w:t>T</w:t>
+      </w:r>
+      <w:r>
+        <w:rPr>
+          <w:rFonts w:asciiTheme="majorBidi" w:hAnsiTheme="majorBidi" w:cstheme="majorBidi"/>
+          <w:sz w:val="28"/>
+          <w:szCs w:val="28"/>
+        </w:rPr>
+        <w:t>o</w:t>
+      </w:r>
+      <w:proofErr w:type="gramEnd"/>
+      <w:r>
+        <w:rPr>
+          <w:rFonts w:asciiTheme="majorBidi" w:hAnsiTheme="majorBidi" w:cstheme="majorBidi"/>
+          <w:sz w:val="28"/>
+          <w:szCs w:val="28"/>
+        </w:rPr>
+        <w:t xml:space="preserve"> </w:t>
+      </w:r>
+      <w:r>
+        <w:rPr>
+          <w:rFonts w:asciiTheme="majorBidi" w:hAnsiTheme="majorBidi" w:cstheme="majorBidi"/>
+          <w:sz w:val="28"/>
+          <w:szCs w:val="28"/>
+        </w:rPr>
+        <w:t>S</w:t>
+      </w:r>
+      <w:r>
+        <w:rPr>
+          <w:rFonts w:asciiTheme="majorBidi" w:hAnsiTheme="majorBidi" w:cstheme="majorBidi"/>
+          <w:sz w:val="28"/>
+          <w:szCs w:val="28"/>
+        </w:rPr>
+        <w:t>olve</w:t>
+      </w:r>
+      <w:r>
+        <w:rPr>
+          <w:rFonts w:asciiTheme="majorBidi" w:hAnsiTheme="majorBidi" w:cstheme="majorBidi"/>
+          <w:sz w:val="28"/>
+          <w:szCs w:val="28"/>
+        </w:rPr>
+        <w:t xml:space="preserve"> - </w:t>
+      </w:r>
+      <w:r>
+        <w:rPr>
+          <w:rFonts w:asciiTheme="majorBidi" w:hAnsiTheme="majorBidi" w:cstheme="majorBidi"/>
+          <w:sz w:val="24"/>
+          <w:szCs w:val="24"/>
+        </w:rPr>
+        <w:t>May 2023</w:t>
+      </w:r>
+      <w:r>
+        <w:rPr>
+          <w:rFonts w:asciiTheme="majorBidi" w:hAnsiTheme="majorBidi" w:cstheme="majorBidi"/>
+          <w:b/>
+          <w:bCs/>
+          <w:sz w:val="28"/>
+          <w:szCs w:val="28"/>
+        </w:rPr>
+        <w:t>.</w:t>
       </w:r>
     </w:p>
     <w:p>
@@ -963,7 +1069,15 @@
           <w:sz w:val="28"/>
           <w:szCs w:val="28"/>
         </w:rPr>
-        <w:t>.NET, Flutter</w:t>
+        <w:t xml:space="preserve">.NET, </w:t>
+      </w:r>
+      <w:r>
+        <w:rPr>
+          <w:rFonts w:asciiTheme="majorBidi" w:hAnsiTheme="majorBidi" w:cstheme="majorBidi"/>
+          <w:sz w:val="28"/>
+          <w:szCs w:val="28"/>
+        </w:rPr>
+        <w:t>Flutter (Android/iOS)</w:t>
       </w:r>
     </w:p>
     <w:p>
@@ -1033,6 +1147,7 @@
           <w:sz w:val="28"/>
           <w:szCs w:val="28"/>
         </w:rPr>
+        <w:lastRenderedPageBreak/>
         <w:t>Tools:</w:t>
       </w:r>
       <w:r>
@@ -1041,23 +1156,23 @@
           <w:sz w:val="28"/>
           <w:szCs w:val="28"/>
         </w:rPr>
-        <w:t xml:space="preserve"> Git, GitHub, </w:t>
-      </w:r>
-      <w:r>
-        <w:rPr>
-          <w:rFonts w:asciiTheme="majorBidi" w:hAnsiTheme="majorBidi" w:cstheme="majorBidi"/>
-          <w:sz w:val="28"/>
-          <w:szCs w:val="28"/>
-        </w:rPr>
-        <w:t>Unity</w:t>
-      </w:r>
-      <w:r>
-        <w:rPr>
-          <w:rFonts w:asciiTheme="majorBidi" w:hAnsiTheme="majorBidi" w:cstheme="majorBidi"/>
-          <w:sz w:val="28"/>
-          <w:szCs w:val="28"/>
-        </w:rPr>
-        <w:t>, Figma</w:t>
+        <w:t xml:space="preserve"> Git, GitHub, Unity, Figma, Canva</w:t>
+      </w:r>
+      <w:r>
+        <w:rPr>
+          <w:rFonts w:asciiTheme="majorBidi" w:hAnsiTheme="majorBidi" w:cstheme="majorBidi"/>
+          <w:sz w:val="28"/>
+          <w:szCs w:val="28"/>
+        </w:rPr>
+        <w:t xml:space="preserve">, </w:t>
+      </w:r>
+      <w:r>
+        <w:rPr>
+          <w:rFonts w:asciiTheme="majorBidi" w:hAnsiTheme="majorBidi" w:cstheme="majorBidi"/>
+          <w:sz w:val="28"/>
+          <w:szCs w:val="28"/>
+        </w:rPr>
+        <w:t>JIRA, Postman, Fiddler</w:t>
       </w:r>
     </w:p>
     <w:p>
@@ -1086,18 +1201,7 @@
           <w:sz w:val="32"/>
           <w:szCs w:val="32"/>
         </w:rPr>
-        <w:lastRenderedPageBreak/>
-        <w:t>Soft</w:t>
-      </w:r>
-      <w:r>
-        <w:rPr>
-          <w:rFonts w:asciiTheme="majorBidi" w:hAnsiTheme="majorBidi" w:cstheme="majorBidi"/>
-          <w:b/>
-          <w:bCs/>
-          <w:sz w:val="32"/>
-          <w:szCs w:val="32"/>
-        </w:rPr>
-        <w:t xml:space="preserve"> Skills</w:t>
+        <w:t>Soft Skills</w:t>
       </w:r>
     </w:p>
     <w:p>
@@ -1193,6 +1297,7 @@
         <w:t>Communication</w:t>
       </w:r>
     </w:p>
+    <w:p/>
     <w:sectPr>
       <w:pgSz w:w="12240" w:h="15840"/>
       <w:pgMar w:top="1080" w:right="1080" w:bottom="1080" w:left="1080" w:header="720" w:footer="720" w:gutter="0"/>
@@ -1226,7 +1331,7 @@
         <v:path o:extrusionok="f" gradientshapeok="t" o:connecttype="rect"/>
         <o:lock v:ext="edit" aspectratio="t"/>
       </v:shapetype>
-      <v:shape id="_x0000_i1236" type="#_x0000_t75" alt="Envelope outline" style="width:19.8pt;height:15pt;visibility:visible" o:gfxdata="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" o:bullet="t">
+      <v:shape id="_x0000_i1063" type="#_x0000_t75" alt="Envelope outline" style="width:19.8pt;height:15pt;visibility:visible" o:gfxdata="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" o:bullet="t">
         <v:imagedata r:id="rId1" o:title="" croptop="-14734f" cropbottom="-14734f" cropleft="-3160f" cropright="-3160f"/>
       </v:shape>
     </w:pict>
@@ -1581,15 +1686,6 @@
   </w:num>
   <w:num w:numId="4" w16cid:durableId="837236061">
     <w:abstractNumId w:val="1"/>
-    <w:lvlOverride w:ilvl="0"/>
-    <w:lvlOverride w:ilvl="1"/>
-    <w:lvlOverride w:ilvl="2"/>
-    <w:lvlOverride w:ilvl="3"/>
-    <w:lvlOverride w:ilvl="4"/>
-    <w:lvlOverride w:ilvl="5"/>
-    <w:lvlOverride w:ilvl="6"/>
-    <w:lvlOverride w:ilvl="7"/>
-    <w:lvlOverride w:ilvl="8"/>
   </w:num>
 </w:numbering>
 </file>

</xml_diff>

<commit_message>
QA cirtificate added, Resume Updated, and AgreeCheckBox style changed
</commit_message>
<xml_diff>
--- a/assets/docs/Rasha Alsaleh.docx
+++ b/assets/docs/Rasha Alsaleh.docx
@@ -61,6 +61,9 @@
         <w:spacing w:before="100" w:line="480" w:lineRule="auto"/>
         <w:rPr>
           <w:rFonts w:asciiTheme="majorBidi" w:hAnsiTheme="majorBidi" w:cstheme="majorBidi"/>
+          <w:b/>
+          <w:bCs/>
+          <w:color w:val="000000" w:themeColor="text1"/>
           <w:sz w:val="24"/>
           <w:szCs w:val="24"/>
         </w:rPr>
@@ -70,8 +73,12 @@
           <w:rPr>
             <w:rStyle w:val="Hyperlink"/>
             <w:rFonts w:asciiTheme="majorBidi" w:hAnsiTheme="majorBidi" w:cstheme="majorBidi"/>
+            <w:b/>
+            <w:bCs/>
+            <w:color w:val="000000" w:themeColor="text1"/>
             <w:sz w:val="24"/>
             <w:szCs w:val="24"/>
+            <w:u w:val="none"/>
           </w:rPr>
           <w:t>(+962) 781277089</w:t>
         </w:r>
@@ -79,6 +86,7 @@
       <w:r>
         <w:rPr>
           <w:rFonts w:asciiTheme="majorBidi" w:hAnsiTheme="majorBidi" w:cstheme="majorBidi"/>
+          <w:color w:val="000000" w:themeColor="text1"/>
           <w:sz w:val="24"/>
           <w:szCs w:val="24"/>
         </w:rPr>
@@ -89,8 +97,12 @@
           <w:rPr>
             <w:rStyle w:val="Hyperlink"/>
             <w:rFonts w:asciiTheme="majorBidi" w:hAnsiTheme="majorBidi" w:cstheme="majorBidi"/>
+            <w:b/>
+            <w:bCs/>
+            <w:color w:val="000000" w:themeColor="text1"/>
             <w:sz w:val="24"/>
             <w:szCs w:val="24"/>
+            <w:u w:val="none"/>
           </w:rPr>
           <w:t>info@rashaalsaleh.com</w:t>
         </w:r>
@@ -98,6 +110,7 @@
       <w:r>
         <w:rPr>
           <w:rFonts w:asciiTheme="majorBidi" w:hAnsiTheme="majorBidi" w:cstheme="majorBidi"/>
+          <w:color w:val="000000" w:themeColor="text1"/>
           <w:sz w:val="24"/>
           <w:szCs w:val="24"/>
         </w:rPr>
@@ -108,8 +121,11 @@
           <w:rPr>
             <w:rStyle w:val="Hyperlink"/>
             <w:rFonts w:asciiTheme="majorBidi" w:hAnsiTheme="majorBidi" w:cstheme="majorBidi"/>
+            <w:b/>
+            <w:bCs/>
             <w:sz w:val="24"/>
             <w:szCs w:val="24"/>
+            <w:u w:val="none"/>
           </w:rPr>
           <w:t>https://rashaalsaleh.com/</w:t>
         </w:r>
@@ -128,15 +144,30 @@
           <w:sz w:val="24"/>
           <w:szCs w:val="24"/>
         </w:rPr>
-        <w:t xml:space="preserve">| GitHub: </w:t>
+        <w:t xml:space="preserve">| </w:t>
+      </w:r>
+      <w:r>
+        <w:rPr>
+          <w:rFonts w:asciiTheme="majorBidi" w:hAnsiTheme="majorBidi" w:cstheme="majorBidi"/>
+          <w:b/>
+          <w:bCs/>
+          <w:color w:val="000000" w:themeColor="text1"/>
+          <w:sz w:val="24"/>
+          <w:szCs w:val="24"/>
+        </w:rPr>
+        <w:t xml:space="preserve">GitHub: </w:t>
       </w:r>
       <w:hyperlink r:id="rId9" w:history="1">
         <w:r>
           <w:rPr>
             <w:rStyle w:val="Hyperlink"/>
             <w:rFonts w:asciiTheme="majorBidi" w:hAnsiTheme="majorBidi" w:cstheme="majorBidi"/>
+            <w:b/>
+            <w:bCs/>
+            <w:color w:val="000000" w:themeColor="text1"/>
             <w:sz w:val="24"/>
             <w:szCs w:val="24"/>
+            <w:u w:val="none"/>
           </w:rPr>
           <w:t>@rasha-2k</w:t>
         </w:r>
@@ -375,21 +406,53 @@
           <w:szCs w:val="28"/>
         </w:rPr>
       </w:pPr>
-      <w:r>
-        <w:rPr>
-          <w:rFonts w:asciiTheme="majorBidi" w:hAnsiTheme="majorBidi" w:cstheme="majorBidi"/>
-          <w:b/>
-          <w:bCs/>
-          <w:sz w:val="28"/>
-          <w:szCs w:val="28"/>
-        </w:rPr>
-        <w:t>QA Software Testing Course</w:t>
-      </w:r>
-      <w:r>
-        <w:rPr>
-          <w:rFonts w:asciiTheme="majorBidi" w:hAnsiTheme="majorBidi" w:cstheme="majorBidi"/>
-          <w:b/>
-          <w:bCs/>
+      <w:hyperlink r:id="rId10" w:history="1">
+        <w:r>
+          <w:rPr>
+            <w:rStyle w:val="Hyperlink"/>
+            <w:rFonts w:asciiTheme="majorBidi" w:hAnsiTheme="majorBidi" w:cstheme="majorBidi"/>
+            <w:b/>
+            <w:bCs/>
+            <w:color w:val="000000" w:themeColor="text1"/>
+            <w:sz w:val="28"/>
+            <w:szCs w:val="28"/>
+            <w:u w:val="none"/>
+          </w:rPr>
+          <w:t>QA Software Testing</w:t>
+        </w:r>
+        <w:r>
+          <w:rPr>
+            <w:rStyle w:val="Hyperlink"/>
+            <w:rFonts w:asciiTheme="majorBidi" w:hAnsiTheme="majorBidi" w:cstheme="majorBidi"/>
+            <w:b/>
+            <w:bCs/>
+            <w:color w:val="000000" w:themeColor="text1"/>
+            <w:sz w:val="28"/>
+            <w:szCs w:val="28"/>
+            <w:u w:val="none"/>
+          </w:rPr>
+          <w:t xml:space="preserve"> </w:t>
+        </w:r>
+        <w:r>
+          <w:rPr>
+            <w:rStyle w:val="Hyperlink"/>
+            <w:rFonts w:asciiTheme="majorBidi" w:hAnsiTheme="majorBidi" w:cstheme="majorBidi"/>
+            <w:b/>
+            <w:bCs/>
+            <w:color w:val="000000" w:themeColor="text1"/>
+            <w:sz w:val="28"/>
+            <w:szCs w:val="28"/>
+            <w:u w:val="none"/>
+          </w:rPr>
+          <w:t>Course</w:t>
+        </w:r>
+      </w:hyperlink>
+      <w:r>
+        <w:rPr>
+          <w:rFonts w:asciiTheme="majorBidi" w:hAnsiTheme="majorBidi" w:cstheme="majorBidi"/>
+          <w:b/>
+          <w:bCs/>
+          <w:color w:val="000000" w:themeColor="text1"/>
           <w:sz w:val="28"/>
           <w:szCs w:val="28"/>
         </w:rPr>
@@ -400,6 +463,7 @@
           <w:rFonts w:asciiTheme="majorBidi" w:hAnsiTheme="majorBidi" w:cstheme="majorBidi"/>
           <w:b/>
           <w:bCs/>
+          <w:color w:val="000000" w:themeColor="text1"/>
           <w:sz w:val="28"/>
           <w:szCs w:val="28"/>
         </w:rPr>
@@ -458,16 +522,21 @@
           <w:szCs w:val="28"/>
         </w:rPr>
       </w:pPr>
-      <w:r>
-        <w:rPr>
-          <w:rFonts w:asciiTheme="majorBidi" w:hAnsiTheme="majorBidi" w:cstheme="majorBidi"/>
-          <w:b/>
-          <w:bCs/>
-          <w:sz w:val="28"/>
-          <w:szCs w:val="28"/>
-        </w:rPr>
-        <w:t>PMI-ACP Exam Prep Course</w:t>
-      </w:r>
+      <w:hyperlink r:id="rId11" w:history="1">
+        <w:r>
+          <w:rPr>
+            <w:rStyle w:val="Hyperlink"/>
+            <w:rFonts w:asciiTheme="majorBidi" w:hAnsiTheme="majorBidi" w:cstheme="majorBidi"/>
+            <w:b/>
+            <w:bCs/>
+            <w:color w:val="000000" w:themeColor="text1"/>
+            <w:sz w:val="28"/>
+            <w:szCs w:val="28"/>
+            <w:u w:val="none"/>
+          </w:rPr>
+          <w:t>PMI-ACP Exam Prep Course</w:t>
+        </w:r>
+      </w:hyperlink>
       <w:r>
         <w:rPr>
           <w:rFonts w:asciiTheme="majorBidi" w:hAnsiTheme="majorBidi" w:cstheme="majorBidi"/>
@@ -552,15 +621,17 @@
           <w:szCs w:val="28"/>
         </w:rPr>
       </w:pPr>
-      <w:hyperlink r:id="rId10" w:history="1">
+      <w:hyperlink r:id="rId12" w:history="1">
         <w:r>
           <w:rPr>
             <w:rStyle w:val="Hyperlink"/>
             <w:rFonts w:asciiTheme="majorBidi" w:hAnsiTheme="majorBidi" w:cstheme="majorBidi"/>
             <w:b/>
             <w:bCs/>
+            <w:color w:val="000000" w:themeColor="text1"/>
             <w:sz w:val="28"/>
             <w:szCs w:val="28"/>
+            <w:u w:val="none"/>
           </w:rPr>
           <w:t>NASA Space Apps Challenge</w:t>
         </w:r>
@@ -642,15 +713,17 @@
           <w:szCs w:val="28"/>
         </w:rPr>
       </w:pPr>
-      <w:hyperlink r:id="rId11" w:history="1">
+      <w:hyperlink r:id="rId13" w:history="1">
         <w:r>
           <w:rPr>
             <w:rStyle w:val="Hyperlink"/>
             <w:rFonts w:asciiTheme="majorBidi" w:hAnsiTheme="majorBidi" w:cstheme="majorBidi"/>
             <w:b/>
             <w:bCs/>
+            <w:color w:val="000000" w:themeColor="text1"/>
             <w:sz w:val="28"/>
             <w:szCs w:val="28"/>
+            <w:u w:val="none"/>
           </w:rPr>
           <w:t>AAU-XDT 2024</w:t>
         </w:r>
@@ -735,15 +808,17 @@
           <w:szCs w:val="28"/>
         </w:rPr>
       </w:pPr>
-      <w:hyperlink r:id="rId12" w:history="1">
+      <w:hyperlink r:id="rId14" w:history="1">
         <w:r>
           <w:rPr>
             <w:rStyle w:val="Hyperlink"/>
             <w:rFonts w:asciiTheme="majorBidi" w:hAnsiTheme="majorBidi" w:cstheme="majorBidi"/>
             <w:b/>
             <w:bCs/>
+            <w:color w:val="000000" w:themeColor="text1"/>
             <w:sz w:val="28"/>
             <w:szCs w:val="28"/>
+            <w:u w:val="none"/>
           </w:rPr>
           <w:t>3Minutes Competition</w:t>
         </w:r>
@@ -889,15 +964,17 @@
           <w:szCs w:val="28"/>
         </w:rPr>
       </w:pPr>
-      <w:hyperlink r:id="rId13" w:history="1">
+      <w:hyperlink r:id="rId15" w:history="1">
         <w:r>
           <w:rPr>
             <w:rStyle w:val="Hyperlink"/>
             <w:rFonts w:asciiTheme="majorBidi" w:hAnsiTheme="majorBidi" w:cstheme="majorBidi"/>
             <w:b/>
             <w:bCs/>
+            <w:color w:val="000000" w:themeColor="text1"/>
             <w:sz w:val="28"/>
             <w:szCs w:val="28"/>
+            <w:u w:val="none"/>
           </w:rPr>
           <w:t>AAU-PC 2023</w:t>
         </w:r>
@@ -1697,7 +1774,7 @@
     </w:p>
     <w:sectPr>
       <w:pgSz w:w="11906" w:h="16838" w:code="9"/>
-      <w:pgMar w:top="1080" w:right="1080" w:bottom="1080" w:left="1080" w:header="720" w:footer="720" w:gutter="0"/>
+      <w:pgMar w:top="1080" w:right="1008" w:bottom="1080" w:left="1008" w:header="720" w:footer="720" w:gutter="0"/>
       <w:cols w:space="720"/>
       <w:docGrid w:linePitch="360"/>
     </w:sectPr>
@@ -1728,7 +1805,7 @@
         <v:path o:extrusionok="f" gradientshapeok="t" o:connecttype="rect"/>
         <o:lock v:ext="edit" aspectratio="t"/>
       </v:shapetype>
-      <v:shape id="_x0000_i1060" type="#_x0000_t75" alt="Envelope outline" style="width:20.05pt;height:15.05pt;visibility:visible" o:gfxdata="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" o:bullet="t">
+      <v:shape id="_x0000_i1035" type="#_x0000_t75" alt="Envelope outline" style="width:19.8pt;height:15pt;visibility:visible" o:gfxdata="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" o:bullet="t">
         <v:imagedata r:id="rId1" o:title="" croptop="-14734f" cropbottom="-14734f" cropleft="-3160f" cropright="-3160f"/>
       </v:shape>
     </w:pict>

</xml_diff>

<commit_message>
Update resume documents to enhance profile summary, technical skills, and achievements
</commit_message>
<xml_diff>
--- a/assets/docs/Rasha Alsaleh.docx
+++ b/assets/docs/Rasha Alsaleh.docx
@@ -75,12 +75,12 @@
             <w:rFonts w:asciiTheme="majorBidi" w:hAnsiTheme="majorBidi" w:cstheme="majorBidi"/>
             <w:b/>
             <w:bCs/>
-            <w:color w:val="000000" w:themeColor="text1"/>
+            <w:color w:val="auto"/>
             <w:sz w:val="24"/>
             <w:szCs w:val="24"/>
             <w:u w:val="none"/>
           </w:rPr>
-          <w:t>(+962) 781277089</w:t>
+          <w:t>+962 781277089</w:t>
         </w:r>
       </w:hyperlink>
       <w:r>
@@ -127,7 +127,7 @@
             <w:szCs w:val="24"/>
             <w:u w:val="none"/>
           </w:rPr>
-          <w:t>https://rashaalsaleh.com/</w:t>
+          <w:t>rashaalsaleh.com</w:t>
         </w:r>
       </w:hyperlink>
       <w:r>
@@ -250,7 +250,23 @@
           <w:sz w:val="28"/>
           <w:szCs w:val="28"/>
         </w:rPr>
-        <w:t>Detail-oriented software engineering student specializing in software quality assurance and testing. I bring a solid understanding of manual testing principles and techniques, with growing expertise in automation testing tools. Recognized for creativity and analytical skills in national competitions, I excel in ensuring the delivery of reliable, high-quality software. I aspire to build a career in software quality assurance and backend development, leveraging my skills in testing, coding, and team collaboration.</w:t>
+        <w:t>Detail-oriented Software Engineer</w:t>
+      </w:r>
+      <w:r>
+        <w:rPr>
+          <w:rFonts w:asciiTheme="majorBidi" w:hAnsiTheme="majorBidi" w:cstheme="majorBidi"/>
+          <w:sz w:val="28"/>
+          <w:szCs w:val="28"/>
+        </w:rPr>
+        <w:t xml:space="preserve"> </w:t>
+      </w:r>
+      <w:r>
+        <w:rPr>
+          <w:rFonts w:asciiTheme="majorBidi" w:hAnsiTheme="majorBidi" w:cstheme="majorBidi"/>
+          <w:sz w:val="28"/>
+          <w:szCs w:val="28"/>
+        </w:rPr>
+        <w:t>with a passion for backend development and quality assurance. Proficient in manual and automated testing techniques with hands-on experience in full-stack development using modern technologies. Known for creativity and problem-solving, demonstrated through national competitions and academic projects. Currently expanding knowledge in DevOps to complement development and QA expertise.</w:t>
       </w:r>
     </w:p>
     <w:p>
@@ -320,14 +336,6 @@
           <w:sz w:val="28"/>
           <w:szCs w:val="28"/>
         </w:rPr>
-        <w:t xml:space="preserve">| </w:t>
-      </w:r>
-      <w:r>
-        <w:rPr>
-          <w:rFonts w:asciiTheme="majorBidi" w:hAnsiTheme="majorBidi" w:cstheme="majorBidi"/>
-          <w:sz w:val="28"/>
-          <w:szCs w:val="28"/>
-        </w:rPr>
         <w:t>Oct 2022 - Present</w:t>
       </w:r>
       <w:r>
@@ -384,6 +392,45 @@
           <w:szCs w:val="32"/>
         </w:rPr>
         <w:t>ions</w:t>
+      </w:r>
+    </w:p>
+    <w:p>
+      <w:pPr>
+        <w:pStyle w:val="ListParagraph"/>
+        <w:numPr>
+          <w:ilvl w:val="0"/>
+          <w:numId w:val="2"/>
+        </w:numPr>
+        <w:tabs>
+          <w:tab w:val="left" w:pos="1404"/>
+        </w:tabs>
+        <w:spacing w:before="240"/>
+        <w:jc w:val="both"/>
+        <w:rPr>
+          <w:rFonts w:asciiTheme="majorBidi" w:hAnsiTheme="majorBidi" w:cstheme="majorBidi"/>
+          <w:b/>
+          <w:bCs/>
+          <w:sz w:val="28"/>
+          <w:szCs w:val="28"/>
+        </w:rPr>
+      </w:pPr>
+      <w:r>
+        <w:rPr>
+          <w:rFonts w:asciiTheme="majorBidi" w:hAnsiTheme="majorBidi" w:cstheme="majorBidi"/>
+          <w:b/>
+          <w:bCs/>
+          <w:sz w:val="28"/>
+          <w:szCs w:val="28"/>
+        </w:rPr>
+        <w:t xml:space="preserve">Automation Testing Course, </w:t>
+      </w:r>
+      <w:r>
+        <w:rPr>
+          <w:rFonts w:asciiTheme="majorBidi" w:hAnsiTheme="majorBidi" w:cstheme="majorBidi"/>
+          <w:sz w:val="28"/>
+          <w:szCs w:val="28"/>
+        </w:rPr>
+        <w:t>The Hope International (2025)</w:t>
       </w:r>
     </w:p>
     <w:p>
@@ -418,33 +465,7 @@
             <w:szCs w:val="28"/>
             <w:u w:val="none"/>
           </w:rPr>
-          <w:t>QA Software Testing</w:t>
-        </w:r>
-        <w:r>
-          <w:rPr>
-            <w:rStyle w:val="Hyperlink"/>
-            <w:rFonts w:asciiTheme="majorBidi" w:hAnsiTheme="majorBidi" w:cstheme="majorBidi"/>
-            <w:b/>
-            <w:bCs/>
-            <w:color w:val="000000" w:themeColor="text1"/>
-            <w:sz w:val="28"/>
-            <w:szCs w:val="28"/>
-            <w:u w:val="none"/>
-          </w:rPr>
-          <w:t xml:space="preserve"> </w:t>
-        </w:r>
-        <w:r>
-          <w:rPr>
-            <w:rStyle w:val="Hyperlink"/>
-            <w:rFonts w:asciiTheme="majorBidi" w:hAnsiTheme="majorBidi" w:cstheme="majorBidi"/>
-            <w:b/>
-            <w:bCs/>
-            <w:color w:val="000000" w:themeColor="text1"/>
-            <w:sz w:val="28"/>
-            <w:szCs w:val="28"/>
-            <w:u w:val="none"/>
-          </w:rPr>
-          <w:t>Course</w:t>
+          <w:t>QA Software Testing Course</w:t>
         </w:r>
       </w:hyperlink>
       <w:r>
@@ -483,23 +504,31 @@
           <w:sz w:val="28"/>
           <w:szCs w:val="28"/>
         </w:rPr>
-        <w:t xml:space="preserve"> |</w:t>
-      </w:r>
-      <w:r>
-        <w:rPr>
-          <w:rFonts w:asciiTheme="majorBidi" w:hAnsiTheme="majorBidi" w:cstheme="majorBidi"/>
-          <w:sz w:val="28"/>
-          <w:szCs w:val="28"/>
-        </w:rPr>
-        <w:t xml:space="preserve"> 40 hours </w:t>
-      </w:r>
-      <w:r>
-        <w:rPr>
-          <w:rFonts w:asciiTheme="majorBidi" w:hAnsiTheme="majorBidi" w:cstheme="majorBidi"/>
-          <w:sz w:val="28"/>
-          <w:szCs w:val="28"/>
-        </w:rPr>
-        <w:t>- 2024</w:t>
+        <w:t xml:space="preserve"> </w:t>
+      </w:r>
+      <w:r>
+        <w:rPr>
+          <w:rFonts w:asciiTheme="majorBidi" w:hAnsiTheme="majorBidi" w:cstheme="majorBidi"/>
+          <w:sz w:val="28"/>
+          <w:szCs w:val="28"/>
+        </w:rPr>
+        <w:t>(</w:t>
+      </w:r>
+      <w:r>
+        <w:rPr>
+          <w:rFonts w:asciiTheme="majorBidi" w:hAnsiTheme="majorBidi" w:cstheme="majorBidi"/>
+          <w:sz w:val="28"/>
+          <w:szCs w:val="28"/>
+        </w:rPr>
+        <w:t>2024</w:t>
+      </w:r>
+      <w:r>
+        <w:rPr>
+          <w:rFonts w:asciiTheme="majorBidi" w:hAnsiTheme="majorBidi" w:cstheme="majorBidi"/>
+          <w:sz w:val="28"/>
+          <w:szCs w:val="28"/>
+        </w:rPr>
+        <w:t>)</w:t>
       </w:r>
     </w:p>
     <w:p>
@@ -571,7 +600,31 @@
           <w:sz w:val="28"/>
           <w:szCs w:val="28"/>
         </w:rPr>
-        <w:t xml:space="preserve"> - 2024</w:t>
+        <w:t xml:space="preserve"> </w:t>
+      </w:r>
+      <w:r>
+        <w:rPr>
+          <w:rFonts w:asciiTheme="majorBidi" w:hAnsiTheme="majorBidi" w:cstheme="majorBidi"/>
+          <w:sz w:val="28"/>
+          <w:szCs w:val="28"/>
+        </w:rPr>
+        <w:t>(</w:t>
+      </w:r>
+      <w:r>
+        <w:rPr>
+          <w:rFonts w:asciiTheme="majorBidi" w:hAnsiTheme="majorBidi" w:cstheme="majorBidi"/>
+          <w:sz w:val="28"/>
+          <w:szCs w:val="28"/>
+        </w:rPr>
+        <w:t>2024</w:t>
+      </w:r>
+      <w:r>
+        <w:rPr>
+          <w:rFonts w:asciiTheme="majorBidi" w:hAnsiTheme="majorBidi" w:cstheme="majorBidi"/>
+          <w:sz w:val="28"/>
+          <w:szCs w:val="28"/>
+        </w:rPr>
+        <w:t>)</w:t>
       </w:r>
     </w:p>
     <w:p>
@@ -600,7 +653,497 @@
           <w:sz w:val="32"/>
           <w:szCs w:val="32"/>
         </w:rPr>
-        <w:t>Activities</w:t>
+        <w:t>Technical Skills</w:t>
+      </w:r>
+    </w:p>
+    <w:p>
+      <w:pPr>
+        <w:pStyle w:val="ListParagraph"/>
+        <w:numPr>
+          <w:ilvl w:val="0"/>
+          <w:numId w:val="2"/>
+        </w:numPr>
+        <w:tabs>
+          <w:tab w:val="left" w:pos="1404"/>
+        </w:tabs>
+        <w:spacing w:before="240" w:line="276" w:lineRule="auto"/>
+        <w:jc w:val="left"/>
+        <w:rPr>
+          <w:rFonts w:asciiTheme="majorBidi" w:hAnsiTheme="majorBidi" w:cstheme="majorBidi"/>
+          <w:b/>
+          <w:bCs/>
+          <w:sz w:val="28"/>
+          <w:szCs w:val="28"/>
+        </w:rPr>
+      </w:pPr>
+      <w:r>
+        <w:rPr>
+          <w:rFonts w:asciiTheme="majorBidi" w:hAnsiTheme="majorBidi" w:cstheme="majorBidi"/>
+          <w:b/>
+          <w:bCs/>
+          <w:sz w:val="28"/>
+          <w:szCs w:val="28"/>
+        </w:rPr>
+        <w:t>Languages</w:t>
+      </w:r>
+      <w:r>
+        <w:rPr>
+          <w:rFonts w:asciiTheme="majorBidi" w:hAnsiTheme="majorBidi" w:cstheme="majorBidi"/>
+          <w:b/>
+          <w:bCs/>
+          <w:sz w:val="28"/>
+          <w:szCs w:val="28"/>
+        </w:rPr>
+        <w:t>:</w:t>
+      </w:r>
+      <w:r>
+        <w:rPr>
+          <w:rFonts w:asciiTheme="majorBidi" w:hAnsiTheme="majorBidi" w:cstheme="majorBidi"/>
+          <w:b/>
+          <w:bCs/>
+          <w:sz w:val="28"/>
+          <w:szCs w:val="28"/>
+        </w:rPr>
+        <w:t xml:space="preserve"> </w:t>
+      </w:r>
+      <w:r>
+        <w:rPr>
+          <w:rFonts w:asciiTheme="majorBidi" w:hAnsiTheme="majorBidi" w:cstheme="majorBidi"/>
+          <w:sz w:val="28"/>
+          <w:szCs w:val="28"/>
+        </w:rPr>
+        <w:t>PHP</w:t>
+      </w:r>
+      <w:r>
+        <w:rPr>
+          <w:rFonts w:asciiTheme="majorBidi" w:hAnsiTheme="majorBidi" w:cstheme="majorBidi"/>
+          <w:sz w:val="28"/>
+          <w:szCs w:val="28"/>
+        </w:rPr>
+        <w:t xml:space="preserve">, </w:t>
+      </w:r>
+      <w:r>
+        <w:rPr>
+          <w:rFonts w:asciiTheme="majorBidi" w:hAnsiTheme="majorBidi" w:cstheme="majorBidi"/>
+          <w:sz w:val="28"/>
+          <w:szCs w:val="28"/>
+        </w:rPr>
+        <w:t>C#,</w:t>
+      </w:r>
+      <w:r>
+        <w:rPr>
+          <w:rFonts w:asciiTheme="majorBidi" w:hAnsiTheme="majorBidi" w:cstheme="majorBidi"/>
+          <w:sz w:val="28"/>
+          <w:szCs w:val="28"/>
+        </w:rPr>
+        <w:t xml:space="preserve"> Go,</w:t>
+      </w:r>
+      <w:r>
+        <w:rPr>
+          <w:rFonts w:asciiTheme="majorBidi" w:hAnsiTheme="majorBidi" w:cstheme="majorBidi"/>
+          <w:sz w:val="28"/>
+          <w:szCs w:val="28"/>
+        </w:rPr>
+        <w:t xml:space="preserve"> </w:t>
+      </w:r>
+      <w:r>
+        <w:rPr>
+          <w:rFonts w:asciiTheme="majorBidi" w:hAnsiTheme="majorBidi" w:cstheme="majorBidi"/>
+          <w:sz w:val="28"/>
+          <w:szCs w:val="28"/>
+        </w:rPr>
+        <w:t>JavaScript</w:t>
+      </w:r>
+      <w:r>
+        <w:rPr>
+          <w:rFonts w:asciiTheme="majorBidi" w:hAnsiTheme="majorBidi" w:cstheme="majorBidi"/>
+          <w:sz w:val="28"/>
+          <w:szCs w:val="28"/>
+        </w:rPr>
+        <w:t>,</w:t>
+      </w:r>
+      <w:r>
+        <w:rPr>
+          <w:rFonts w:asciiTheme="majorBidi" w:hAnsiTheme="majorBidi" w:cstheme="majorBidi"/>
+          <w:sz w:val="28"/>
+          <w:szCs w:val="28"/>
+        </w:rPr>
+        <w:t xml:space="preserve"> </w:t>
+      </w:r>
+      <w:r>
+        <w:rPr>
+          <w:rFonts w:asciiTheme="majorBidi" w:hAnsiTheme="majorBidi" w:cstheme="majorBidi"/>
+          <w:sz w:val="28"/>
+          <w:szCs w:val="28"/>
+        </w:rPr>
+        <w:t>JAVA</w:t>
+      </w:r>
+    </w:p>
+    <w:p>
+      <w:pPr>
+        <w:pStyle w:val="ListParagraph"/>
+        <w:numPr>
+          <w:ilvl w:val="0"/>
+          <w:numId w:val="2"/>
+        </w:numPr>
+        <w:tabs>
+          <w:tab w:val="left" w:pos="1404"/>
+        </w:tabs>
+        <w:spacing w:before="240" w:line="276" w:lineRule="auto"/>
+        <w:jc w:val="left"/>
+        <w:rPr>
+          <w:rFonts w:asciiTheme="majorBidi" w:hAnsiTheme="majorBidi" w:cstheme="majorBidi"/>
+          <w:sz w:val="28"/>
+          <w:szCs w:val="28"/>
+        </w:rPr>
+      </w:pPr>
+      <w:r>
+        <w:rPr>
+          <w:rFonts w:asciiTheme="majorBidi" w:hAnsiTheme="majorBidi" w:cstheme="majorBidi"/>
+          <w:b/>
+          <w:bCs/>
+          <w:sz w:val="28"/>
+          <w:szCs w:val="28"/>
+        </w:rPr>
+        <w:t>Databases:</w:t>
+      </w:r>
+      <w:r>
+        <w:rPr>
+          <w:rFonts w:asciiTheme="majorBidi" w:hAnsiTheme="majorBidi" w:cstheme="majorBidi"/>
+          <w:sz w:val="28"/>
+          <w:szCs w:val="28"/>
+        </w:rPr>
+        <w:t xml:space="preserve"> MySQL,</w:t>
+      </w:r>
+      <w:r>
+        <w:t xml:space="preserve"> </w:t>
+      </w:r>
+      <w:r>
+        <w:rPr>
+          <w:rFonts w:asciiTheme="majorBidi" w:hAnsiTheme="majorBidi" w:cstheme="majorBidi"/>
+          <w:sz w:val="28"/>
+          <w:szCs w:val="28"/>
+        </w:rPr>
+        <w:t>PostgreSQL, SQLite, SQL Server</w:t>
+      </w:r>
+    </w:p>
+    <w:p>
+      <w:pPr>
+        <w:pStyle w:val="ListParagraph"/>
+        <w:numPr>
+          <w:ilvl w:val="0"/>
+          <w:numId w:val="2"/>
+        </w:numPr>
+        <w:tabs>
+          <w:tab w:val="left" w:pos="1404"/>
+        </w:tabs>
+        <w:spacing w:before="240" w:line="276" w:lineRule="auto"/>
+        <w:jc w:val="left"/>
+        <w:rPr>
+          <w:rFonts w:asciiTheme="majorBidi" w:hAnsiTheme="majorBidi" w:cstheme="majorBidi"/>
+          <w:b/>
+          <w:bCs/>
+          <w:sz w:val="28"/>
+          <w:szCs w:val="28"/>
+        </w:rPr>
+      </w:pPr>
+      <w:r>
+        <w:rPr>
+          <w:rFonts w:asciiTheme="majorBidi" w:hAnsiTheme="majorBidi" w:cstheme="majorBidi"/>
+          <w:b/>
+          <w:bCs/>
+          <w:sz w:val="28"/>
+          <w:szCs w:val="28"/>
+        </w:rPr>
+        <w:t>QA/Testing</w:t>
+      </w:r>
+      <w:r>
+        <w:rPr>
+          <w:rFonts w:asciiTheme="majorBidi" w:hAnsiTheme="majorBidi" w:cstheme="majorBidi"/>
+          <w:b/>
+          <w:bCs/>
+          <w:sz w:val="28"/>
+          <w:szCs w:val="28"/>
+        </w:rPr>
+        <w:t>:</w:t>
+      </w:r>
+      <w:r>
+        <w:rPr>
+          <w:rFonts w:asciiTheme="majorBidi" w:hAnsiTheme="majorBidi" w:cstheme="majorBidi"/>
+          <w:sz w:val="28"/>
+          <w:szCs w:val="28"/>
+        </w:rPr>
+        <w:t xml:space="preserve"> </w:t>
+      </w:r>
+      <w:r>
+        <w:rPr>
+          <w:rFonts w:asciiTheme="majorBidi" w:hAnsiTheme="majorBidi" w:cstheme="majorBidi"/>
+          <w:sz w:val="28"/>
+          <w:szCs w:val="28"/>
+        </w:rPr>
+        <w:t xml:space="preserve">Selenium, </w:t>
+      </w:r>
+      <w:r>
+        <w:rPr>
+          <w:rFonts w:asciiTheme="majorBidi" w:hAnsiTheme="majorBidi" w:cstheme="majorBidi"/>
+          <w:sz w:val="28"/>
+          <w:szCs w:val="28"/>
+        </w:rPr>
+        <w:t xml:space="preserve">Postman, </w:t>
+      </w:r>
+      <w:r>
+        <w:rPr>
+          <w:rFonts w:asciiTheme="majorBidi" w:hAnsiTheme="majorBidi" w:cstheme="majorBidi"/>
+          <w:sz w:val="28"/>
+          <w:szCs w:val="28"/>
+        </w:rPr>
+        <w:t>Fiddle</w:t>
+      </w:r>
+      <w:r>
+        <w:rPr>
+          <w:rFonts w:asciiTheme="majorBidi" w:hAnsiTheme="majorBidi" w:cstheme="majorBidi"/>
+          <w:sz w:val="28"/>
+          <w:szCs w:val="28"/>
+        </w:rPr>
+        <w:t>r</w:t>
+      </w:r>
+      <w:r>
+        <w:rPr>
+          <w:rFonts w:asciiTheme="majorBidi" w:hAnsiTheme="majorBidi" w:cstheme="majorBidi"/>
+          <w:sz w:val="28"/>
+          <w:szCs w:val="28"/>
+        </w:rPr>
+        <w:t xml:space="preserve">, </w:t>
+      </w:r>
+      <w:r>
+        <w:rPr>
+          <w:rFonts w:asciiTheme="majorBidi" w:hAnsiTheme="majorBidi" w:cstheme="majorBidi"/>
+          <w:sz w:val="28"/>
+          <w:szCs w:val="28"/>
+        </w:rPr>
+        <w:t>J</w:t>
+      </w:r>
+      <w:r>
+        <w:rPr>
+          <w:rFonts w:asciiTheme="majorBidi" w:hAnsiTheme="majorBidi" w:cstheme="majorBidi"/>
+          <w:sz w:val="28"/>
+          <w:szCs w:val="28"/>
+        </w:rPr>
+        <w:t>u</w:t>
+      </w:r>
+      <w:r>
+        <w:rPr>
+          <w:rFonts w:asciiTheme="majorBidi" w:hAnsiTheme="majorBidi" w:cstheme="majorBidi"/>
+          <w:sz w:val="28"/>
+          <w:szCs w:val="28"/>
+        </w:rPr>
+        <w:t>nit</w:t>
+      </w:r>
+    </w:p>
+    <w:p>
+      <w:pPr>
+        <w:pStyle w:val="ListParagraph"/>
+        <w:numPr>
+          <w:ilvl w:val="0"/>
+          <w:numId w:val="2"/>
+        </w:numPr>
+        <w:tabs>
+          <w:tab w:val="left" w:pos="1404"/>
+        </w:tabs>
+        <w:spacing w:before="240" w:line="276" w:lineRule="auto"/>
+        <w:jc w:val="left"/>
+        <w:rPr>
+          <w:rFonts w:asciiTheme="majorBidi" w:hAnsiTheme="majorBidi" w:cstheme="majorBidi"/>
+          <w:b/>
+          <w:bCs/>
+          <w:sz w:val="28"/>
+          <w:szCs w:val="28"/>
+        </w:rPr>
+      </w:pPr>
+      <w:r>
+        <w:rPr>
+          <w:rFonts w:asciiTheme="majorBidi" w:hAnsiTheme="majorBidi" w:cstheme="majorBidi"/>
+          <w:b/>
+          <w:bCs/>
+          <w:sz w:val="28"/>
+          <w:szCs w:val="28"/>
+        </w:rPr>
+        <w:t>DevOps &amp; Infra</w:t>
+      </w:r>
+      <w:r>
+        <w:rPr>
+          <w:rFonts w:asciiTheme="majorBidi" w:hAnsiTheme="majorBidi" w:cstheme="majorBidi"/>
+          <w:b/>
+          <w:bCs/>
+          <w:sz w:val="28"/>
+          <w:szCs w:val="28"/>
+        </w:rPr>
+        <w:t xml:space="preserve">: </w:t>
+      </w:r>
+      <w:r>
+        <w:rPr>
+          <w:rFonts w:asciiTheme="majorBidi" w:hAnsiTheme="majorBidi" w:cstheme="majorBidi"/>
+          <w:sz w:val="28"/>
+          <w:szCs w:val="28"/>
+        </w:rPr>
+        <w:t>Docker, GitHub Actions, Bash, PowerShell, VirtualBox, Linux</w:t>
+      </w:r>
+    </w:p>
+    <w:p>
+      <w:pPr>
+        <w:pStyle w:val="ListParagraph"/>
+        <w:numPr>
+          <w:ilvl w:val="0"/>
+          <w:numId w:val="2"/>
+        </w:numPr>
+        <w:tabs>
+          <w:tab w:val="left" w:pos="1404"/>
+        </w:tabs>
+        <w:spacing w:before="240" w:line="276" w:lineRule="auto"/>
+        <w:jc w:val="left"/>
+        <w:rPr>
+          <w:rFonts w:asciiTheme="majorBidi" w:hAnsiTheme="majorBidi" w:cstheme="majorBidi"/>
+          <w:sz w:val="28"/>
+          <w:szCs w:val="28"/>
+        </w:rPr>
+      </w:pPr>
+      <w:r>
+        <w:rPr>
+          <w:rFonts w:asciiTheme="majorBidi" w:hAnsiTheme="majorBidi" w:cstheme="majorBidi"/>
+          <w:b/>
+          <w:bCs/>
+          <w:sz w:val="28"/>
+          <w:szCs w:val="28"/>
+        </w:rPr>
+        <w:t>Frameworks:</w:t>
+      </w:r>
+      <w:r>
+        <w:rPr>
+          <w:rFonts w:asciiTheme="majorBidi" w:hAnsiTheme="majorBidi" w:cstheme="majorBidi"/>
+          <w:sz w:val="28"/>
+          <w:szCs w:val="28"/>
+        </w:rPr>
+        <w:t xml:space="preserve"> </w:t>
+      </w:r>
+      <w:r>
+        <w:rPr>
+          <w:rFonts w:asciiTheme="majorBidi" w:hAnsiTheme="majorBidi" w:cstheme="majorBidi"/>
+          <w:sz w:val="28"/>
+          <w:szCs w:val="28"/>
+        </w:rPr>
+        <w:t>.NET</w:t>
+      </w:r>
+      <w:r>
+        <w:rPr>
+          <w:rFonts w:asciiTheme="majorBidi" w:hAnsiTheme="majorBidi" w:cstheme="majorBidi"/>
+          <w:sz w:val="28"/>
+          <w:szCs w:val="28"/>
+        </w:rPr>
+        <w:t xml:space="preserve">, Tailwind CSS, </w:t>
+      </w:r>
+      <w:r>
+        <w:rPr>
+          <w:rFonts w:asciiTheme="majorBidi" w:hAnsiTheme="majorBidi" w:cstheme="majorBidi"/>
+          <w:sz w:val="28"/>
+          <w:szCs w:val="28"/>
+        </w:rPr>
+        <w:t>Bootstrap</w:t>
+      </w:r>
+    </w:p>
+    <w:p>
+      <w:pPr>
+        <w:pStyle w:val="ListParagraph"/>
+        <w:numPr>
+          <w:ilvl w:val="0"/>
+          <w:numId w:val="2"/>
+        </w:numPr>
+        <w:tabs>
+          <w:tab w:val="left" w:pos="1404"/>
+        </w:tabs>
+        <w:spacing w:before="240" w:line="276" w:lineRule="auto"/>
+        <w:jc w:val="left"/>
+        <w:rPr>
+          <w:rFonts w:asciiTheme="majorBidi" w:hAnsiTheme="majorBidi" w:cstheme="majorBidi"/>
+          <w:b/>
+          <w:bCs/>
+          <w:sz w:val="28"/>
+          <w:szCs w:val="28"/>
+        </w:rPr>
+      </w:pPr>
+      <w:r>
+        <w:rPr>
+          <w:rFonts w:asciiTheme="majorBidi" w:hAnsiTheme="majorBidi" w:cstheme="majorBidi"/>
+          <w:b/>
+          <w:bCs/>
+          <w:sz w:val="28"/>
+          <w:szCs w:val="28"/>
+        </w:rPr>
+        <w:t>PM &amp; Design</w:t>
+      </w:r>
+      <w:r>
+        <w:rPr>
+          <w:rFonts w:asciiTheme="majorBidi" w:hAnsiTheme="majorBidi" w:cstheme="majorBidi"/>
+          <w:b/>
+          <w:bCs/>
+          <w:sz w:val="28"/>
+          <w:szCs w:val="28"/>
+        </w:rPr>
+        <w:t>:</w:t>
+      </w:r>
+      <w:r>
+        <w:rPr>
+          <w:rFonts w:asciiTheme="majorBidi" w:hAnsiTheme="majorBidi" w:cstheme="majorBidi"/>
+          <w:sz w:val="28"/>
+          <w:szCs w:val="28"/>
+        </w:rPr>
+        <w:t xml:space="preserve"> </w:t>
+      </w:r>
+      <w:r>
+        <w:rPr>
+          <w:rFonts w:asciiTheme="majorBidi" w:hAnsiTheme="majorBidi" w:cstheme="majorBidi"/>
+          <w:sz w:val="28"/>
+          <w:szCs w:val="28"/>
+        </w:rPr>
+        <w:t>Jira, Trello, Figma, Azure DevOps</w:t>
+      </w:r>
+      <w:r>
+        <w:rPr>
+          <w:rFonts w:asciiTheme="majorBidi" w:hAnsiTheme="majorBidi" w:cstheme="majorBidi"/>
+          <w:b/>
+          <w:bCs/>
+          <w:sz w:val="32"/>
+          <w:szCs w:val="32"/>
+        </w:rPr>
+        <w:t xml:space="preserve"> </w:t>
+      </w:r>
+    </w:p>
+    <w:p>
+      <w:pPr>
+        <w:pBdr>
+          <w:bottom w:val="single" w:sz="4" w:space="1" w:color="auto"/>
+        </w:pBdr>
+        <w:tabs>
+          <w:tab w:val="left" w:pos="1404"/>
+        </w:tabs>
+        <w:spacing w:before="240"/>
+        <w:jc w:val="both"/>
+        <w:rPr>
+          <w:rFonts w:asciiTheme="majorBidi" w:hAnsiTheme="majorBidi" w:cstheme="majorBidi"/>
+          <w:b/>
+          <w:bCs/>
+          <w:sz w:val="32"/>
+          <w:szCs w:val="32"/>
+        </w:rPr>
+      </w:pPr>
+      <w:r>
+        <w:rPr>
+          <w:rFonts w:asciiTheme="majorBidi" w:hAnsiTheme="majorBidi" w:cstheme="majorBidi"/>
+          <w:b/>
+          <w:bCs/>
+          <w:sz w:val="32"/>
+          <w:szCs w:val="32"/>
+        </w:rPr>
+        <w:t>Achievements &amp; Activities</w:t>
       </w:r>
     </w:p>
     <w:p>
@@ -652,23 +1195,7 @@
           <w:sz w:val="28"/>
           <w:szCs w:val="28"/>
         </w:rPr>
-        <w:t>The Creativity Award |</w:t>
-      </w:r>
-      <w:r>
-        <w:rPr>
-          <w:rFonts w:asciiTheme="majorBidi" w:hAnsiTheme="majorBidi" w:cstheme="majorBidi"/>
-          <w:sz w:val="28"/>
-          <w:szCs w:val="28"/>
-        </w:rPr>
-        <w:t xml:space="preserve"> </w:t>
-      </w:r>
-      <w:r>
-        <w:rPr>
-          <w:rFonts w:asciiTheme="majorBidi" w:hAnsiTheme="majorBidi" w:cstheme="majorBidi"/>
-          <w:sz w:val="28"/>
-          <w:szCs w:val="28"/>
-        </w:rPr>
-        <w:t xml:space="preserve">By developing The Planetary Explorer Game - </w:t>
+        <w:t xml:space="preserve">Creativity Award - </w:t>
       </w:r>
       <w:r>
         <w:rPr>
@@ -771,7 +1298,7 @@
           <w:sz w:val="28"/>
           <w:szCs w:val="28"/>
         </w:rPr>
-        <w:t xml:space="preserve"> place | UI/UX design competition - </w:t>
+        <w:t xml:space="preserve"> place, UI/UX design competition - </w:t>
       </w:r>
       <w:r>
         <w:rPr>
@@ -864,25 +1391,7 @@
           <w:sz w:val="28"/>
           <w:szCs w:val="28"/>
         </w:rPr>
-        <w:t xml:space="preserve"> | By introducing </w:t>
-      </w:r>
-      <w:proofErr w:type="spellStart"/>
-      <w:r>
-        <w:rPr>
-          <w:rFonts w:asciiTheme="majorBidi" w:hAnsiTheme="majorBidi" w:cstheme="majorBidi"/>
-          <w:sz w:val="28"/>
-          <w:szCs w:val="28"/>
-        </w:rPr>
-        <w:t>UniBus</w:t>
-      </w:r>
-      <w:proofErr w:type="spellEnd"/>
-      <w:r>
-        <w:rPr>
-          <w:rFonts w:asciiTheme="majorBidi" w:hAnsiTheme="majorBidi" w:cstheme="majorBidi"/>
-          <w:sz w:val="28"/>
-          <w:szCs w:val="28"/>
-        </w:rPr>
-        <w:t xml:space="preserve"> project idea - </w:t>
+        <w:t xml:space="preserve"> (UniBus project idea) - </w:t>
       </w:r>
       <w:r>
         <w:rPr>
@@ -1020,7 +1529,7 @@
           <w:sz w:val="28"/>
           <w:szCs w:val="28"/>
         </w:rPr>
-        <w:t xml:space="preserve"> |</w:t>
+        <w:t>,</w:t>
       </w:r>
       <w:r>
         <w:rPr>
@@ -1116,656 +1625,6 @@
           <w:rFonts w:asciiTheme="majorBidi" w:hAnsiTheme="majorBidi" w:cstheme="majorBidi"/>
           <w:b/>
           <w:bCs/>
-          <w:sz w:val="28"/>
-          <w:szCs w:val="28"/>
-        </w:rPr>
-        <w:t>.</w:t>
-      </w:r>
-    </w:p>
-    <w:p>
-      <w:pPr>
-        <w:pBdr>
-          <w:bottom w:val="single" w:sz="4" w:space="1" w:color="auto"/>
-        </w:pBdr>
-        <w:tabs>
-          <w:tab w:val="left" w:pos="1404"/>
-        </w:tabs>
-        <w:spacing w:before="240"/>
-        <w:jc w:val="both"/>
-        <w:rPr>
-          <w:rFonts w:asciiTheme="majorBidi" w:hAnsiTheme="majorBidi" w:cstheme="majorBidi"/>
-          <w:b/>
-          <w:bCs/>
-          <w:sz w:val="32"/>
-          <w:szCs w:val="32"/>
-        </w:rPr>
-      </w:pPr>
-      <w:r>
-        <w:rPr>
-          <w:rFonts w:asciiTheme="majorBidi" w:hAnsiTheme="majorBidi" w:cstheme="majorBidi"/>
-          <w:b/>
-          <w:bCs/>
-          <w:sz w:val="32"/>
-          <w:szCs w:val="32"/>
-        </w:rPr>
-        <w:t>Technical Skills</w:t>
-      </w:r>
-    </w:p>
-    <w:p>
-      <w:pPr>
-        <w:pStyle w:val="ListParagraph"/>
-        <w:numPr>
-          <w:ilvl w:val="0"/>
-          <w:numId w:val="2"/>
-        </w:numPr>
-        <w:tabs>
-          <w:tab w:val="left" w:pos="1404"/>
-        </w:tabs>
-        <w:spacing w:before="240"/>
-        <w:jc w:val="left"/>
-        <w:rPr>
-          <w:rFonts w:asciiTheme="majorBidi" w:hAnsiTheme="majorBidi" w:cstheme="majorBidi"/>
-          <w:b/>
-          <w:bCs/>
-          <w:sz w:val="28"/>
-          <w:szCs w:val="28"/>
-        </w:rPr>
-      </w:pPr>
-      <w:r>
-        <w:rPr>
-          <w:rFonts w:asciiTheme="majorBidi" w:hAnsiTheme="majorBidi" w:cstheme="majorBidi"/>
-          <w:b/>
-          <w:bCs/>
-          <w:sz w:val="28"/>
-          <w:szCs w:val="28"/>
-        </w:rPr>
-        <w:t>Programming</w:t>
-      </w:r>
-      <w:r>
-        <w:rPr>
-          <w:rFonts w:asciiTheme="majorBidi" w:hAnsiTheme="majorBidi" w:cstheme="majorBidi"/>
-          <w:b/>
-          <w:bCs/>
-          <w:sz w:val="28"/>
-          <w:szCs w:val="28"/>
-        </w:rPr>
-        <w:t xml:space="preserve"> Languages</w:t>
-      </w:r>
-      <w:r>
-        <w:rPr>
-          <w:rFonts w:asciiTheme="majorBidi" w:hAnsiTheme="majorBidi" w:cstheme="majorBidi"/>
-          <w:b/>
-          <w:bCs/>
-          <w:sz w:val="28"/>
-          <w:szCs w:val="28"/>
-        </w:rPr>
-        <w:t>:</w:t>
-      </w:r>
-      <w:r>
-        <w:rPr>
-          <w:rFonts w:asciiTheme="majorBidi" w:hAnsiTheme="majorBidi" w:cstheme="majorBidi"/>
-          <w:b/>
-          <w:bCs/>
-          <w:sz w:val="28"/>
-          <w:szCs w:val="28"/>
-        </w:rPr>
-        <w:t xml:space="preserve"> </w:t>
-      </w:r>
-      <w:r>
-        <w:rPr>
-          <w:rFonts w:asciiTheme="majorBidi" w:hAnsiTheme="majorBidi" w:cstheme="majorBidi"/>
-          <w:sz w:val="28"/>
-          <w:szCs w:val="28"/>
-        </w:rPr>
-        <w:t>C++, JAVA, C#,</w:t>
-      </w:r>
-      <w:r>
-        <w:rPr>
-          <w:rFonts w:asciiTheme="majorBidi" w:hAnsiTheme="majorBidi" w:cstheme="majorBidi"/>
-          <w:sz w:val="28"/>
-          <w:szCs w:val="28"/>
-        </w:rPr>
-        <w:t xml:space="preserve"> </w:t>
-      </w:r>
-      <w:r>
-        <w:rPr>
-          <w:rFonts w:asciiTheme="majorBidi" w:hAnsiTheme="majorBidi" w:cstheme="majorBidi"/>
-          <w:sz w:val="28"/>
-          <w:szCs w:val="28"/>
-        </w:rPr>
-        <w:t>PHP</w:t>
-      </w:r>
-      <w:r>
-        <w:rPr>
-          <w:rFonts w:asciiTheme="majorBidi" w:hAnsiTheme="majorBidi" w:cstheme="majorBidi"/>
-          <w:sz w:val="28"/>
-          <w:szCs w:val="28"/>
-        </w:rPr>
-        <w:t xml:space="preserve">, </w:t>
-      </w:r>
-      <w:r>
-        <w:rPr>
-          <w:rFonts w:asciiTheme="majorBidi" w:hAnsiTheme="majorBidi" w:cstheme="majorBidi"/>
-          <w:sz w:val="28"/>
-          <w:szCs w:val="28"/>
-        </w:rPr>
-        <w:t>JavaScript,</w:t>
-      </w:r>
-      <w:r>
-        <w:rPr>
-          <w:rFonts w:asciiTheme="majorBidi" w:hAnsiTheme="majorBidi" w:cstheme="majorBidi"/>
-          <w:sz w:val="28"/>
-          <w:szCs w:val="28"/>
-        </w:rPr>
-        <w:t xml:space="preserve"> Dart</w:t>
-      </w:r>
-      <w:r>
-        <w:rPr>
-          <w:rFonts w:asciiTheme="majorBidi" w:hAnsiTheme="majorBidi" w:cstheme="majorBidi"/>
-          <w:sz w:val="28"/>
-          <w:szCs w:val="28"/>
-        </w:rPr>
-        <w:t>.</w:t>
-      </w:r>
-    </w:p>
-    <w:p>
-      <w:pPr>
-        <w:pStyle w:val="ListParagraph"/>
-        <w:numPr>
-          <w:ilvl w:val="0"/>
-          <w:numId w:val="2"/>
-        </w:numPr>
-        <w:tabs>
-          <w:tab w:val="left" w:pos="1404"/>
-        </w:tabs>
-        <w:spacing w:before="240"/>
-        <w:jc w:val="left"/>
-        <w:rPr>
-          <w:rFonts w:asciiTheme="majorBidi" w:hAnsiTheme="majorBidi" w:cstheme="majorBidi"/>
-          <w:b/>
-          <w:bCs/>
-          <w:sz w:val="28"/>
-          <w:szCs w:val="28"/>
-        </w:rPr>
-      </w:pPr>
-      <w:r>
-        <w:rPr>
-          <w:rFonts w:asciiTheme="majorBidi" w:hAnsiTheme="majorBidi" w:cstheme="majorBidi"/>
-          <w:b/>
-          <w:bCs/>
-          <w:sz w:val="28"/>
-          <w:szCs w:val="28"/>
-        </w:rPr>
-        <w:t>Testing Tools</w:t>
-      </w:r>
-      <w:r>
-        <w:rPr>
-          <w:rFonts w:asciiTheme="majorBidi" w:hAnsiTheme="majorBidi" w:cstheme="majorBidi"/>
-          <w:b/>
-          <w:bCs/>
-          <w:sz w:val="28"/>
-          <w:szCs w:val="28"/>
-        </w:rPr>
-        <w:t>:</w:t>
-      </w:r>
-      <w:r>
-        <w:rPr>
-          <w:rFonts w:asciiTheme="majorBidi" w:hAnsiTheme="majorBidi" w:cstheme="majorBidi"/>
-          <w:sz w:val="28"/>
-          <w:szCs w:val="28"/>
-        </w:rPr>
-        <w:t xml:space="preserve"> Postman</w:t>
-      </w:r>
-      <w:r>
-        <w:rPr>
-          <w:rFonts w:asciiTheme="majorBidi" w:hAnsiTheme="majorBidi" w:cstheme="majorBidi"/>
-          <w:sz w:val="28"/>
-          <w:szCs w:val="28"/>
-        </w:rPr>
-        <w:t xml:space="preserve"> </w:t>
-      </w:r>
-      <w:r>
-        <w:rPr>
-          <w:rFonts w:asciiTheme="majorBidi" w:hAnsiTheme="majorBidi" w:cstheme="majorBidi"/>
-          <w:sz w:val="28"/>
-          <w:szCs w:val="28"/>
-        </w:rPr>
-        <w:t>(API testing)</w:t>
-      </w:r>
-      <w:r>
-        <w:rPr>
-          <w:rFonts w:asciiTheme="majorBidi" w:hAnsiTheme="majorBidi" w:cstheme="majorBidi"/>
-          <w:sz w:val="28"/>
-          <w:szCs w:val="28"/>
-        </w:rPr>
-        <w:t xml:space="preserve">, </w:t>
-      </w:r>
-      <w:r>
-        <w:rPr>
-          <w:rFonts w:asciiTheme="majorBidi" w:hAnsiTheme="majorBidi" w:cstheme="majorBidi"/>
-          <w:sz w:val="28"/>
-          <w:szCs w:val="28"/>
-        </w:rPr>
-        <w:t xml:space="preserve">Selenium, </w:t>
-      </w:r>
-      <w:r>
-        <w:rPr>
-          <w:rFonts w:asciiTheme="majorBidi" w:hAnsiTheme="majorBidi" w:cstheme="majorBidi"/>
-          <w:sz w:val="28"/>
-          <w:szCs w:val="28"/>
-        </w:rPr>
-        <w:t>Fiddler</w:t>
-      </w:r>
-      <w:r>
-        <w:rPr>
-          <w:rFonts w:asciiTheme="majorBidi" w:hAnsiTheme="majorBidi" w:cstheme="majorBidi"/>
-          <w:sz w:val="28"/>
-          <w:szCs w:val="28"/>
-        </w:rPr>
-        <w:t xml:space="preserve"> (</w:t>
-      </w:r>
-      <w:r>
-        <w:rPr>
-          <w:rFonts w:asciiTheme="majorBidi" w:hAnsiTheme="majorBidi" w:cstheme="majorBidi"/>
-          <w:sz w:val="28"/>
-          <w:szCs w:val="28"/>
-        </w:rPr>
-        <w:t xml:space="preserve">API </w:t>
-      </w:r>
-      <w:r>
-        <w:rPr>
-          <w:rFonts w:asciiTheme="majorBidi" w:hAnsiTheme="majorBidi" w:cstheme="majorBidi"/>
-          <w:sz w:val="28"/>
-          <w:szCs w:val="28"/>
-        </w:rPr>
-        <w:t>&amp;</w:t>
-      </w:r>
-      <w:r>
-        <w:rPr>
-          <w:rFonts w:asciiTheme="majorBidi" w:hAnsiTheme="majorBidi" w:cstheme="majorBidi"/>
-          <w:sz w:val="28"/>
-          <w:szCs w:val="28"/>
-        </w:rPr>
-        <w:t xml:space="preserve"> Performance</w:t>
-      </w:r>
-      <w:r>
-        <w:rPr>
-          <w:rFonts w:asciiTheme="majorBidi" w:hAnsiTheme="majorBidi" w:cstheme="majorBidi"/>
-          <w:sz w:val="28"/>
-          <w:szCs w:val="28"/>
-        </w:rPr>
-        <w:t xml:space="preserve"> </w:t>
-      </w:r>
-      <w:r>
-        <w:rPr>
-          <w:rFonts w:asciiTheme="majorBidi" w:hAnsiTheme="majorBidi" w:cstheme="majorBidi"/>
-          <w:sz w:val="28"/>
-          <w:szCs w:val="28"/>
-        </w:rPr>
-        <w:t xml:space="preserve">testing), </w:t>
-      </w:r>
-      <w:r>
-        <w:rPr>
-          <w:rFonts w:asciiTheme="majorBidi" w:hAnsiTheme="majorBidi" w:cstheme="majorBidi"/>
-          <w:sz w:val="28"/>
-          <w:szCs w:val="28"/>
-        </w:rPr>
-        <w:t>J</w:t>
-      </w:r>
-      <w:r>
-        <w:rPr>
-          <w:rFonts w:asciiTheme="majorBidi" w:hAnsiTheme="majorBidi" w:cstheme="majorBidi"/>
-          <w:sz w:val="28"/>
-          <w:szCs w:val="28"/>
-        </w:rPr>
-        <w:t>u</w:t>
-      </w:r>
-      <w:r>
-        <w:rPr>
-          <w:rFonts w:asciiTheme="majorBidi" w:hAnsiTheme="majorBidi" w:cstheme="majorBidi"/>
-          <w:sz w:val="28"/>
-          <w:szCs w:val="28"/>
-        </w:rPr>
-        <w:t>nit</w:t>
-      </w:r>
-      <w:r>
-        <w:rPr>
-          <w:rFonts w:asciiTheme="majorBidi" w:hAnsiTheme="majorBidi" w:cstheme="majorBidi"/>
-          <w:sz w:val="28"/>
-          <w:szCs w:val="28"/>
-        </w:rPr>
-        <w:t>.</w:t>
-      </w:r>
-    </w:p>
-    <w:p>
-      <w:pPr>
-        <w:pStyle w:val="ListParagraph"/>
-        <w:numPr>
-          <w:ilvl w:val="0"/>
-          <w:numId w:val="2"/>
-        </w:numPr>
-        <w:tabs>
-          <w:tab w:val="left" w:pos="1404"/>
-        </w:tabs>
-        <w:spacing w:before="240"/>
-        <w:jc w:val="left"/>
-        <w:rPr>
-          <w:rFonts w:asciiTheme="majorBidi" w:hAnsiTheme="majorBidi" w:cstheme="majorBidi"/>
-          <w:sz w:val="28"/>
-          <w:szCs w:val="28"/>
-        </w:rPr>
-      </w:pPr>
-      <w:r>
-        <w:rPr>
-          <w:rFonts w:asciiTheme="majorBidi" w:hAnsiTheme="majorBidi" w:cstheme="majorBidi"/>
-          <w:b/>
-          <w:bCs/>
-          <w:sz w:val="28"/>
-          <w:szCs w:val="28"/>
-        </w:rPr>
-        <w:t xml:space="preserve">Automation Testing: </w:t>
-      </w:r>
-      <w:r>
-        <w:rPr>
-          <w:rFonts w:asciiTheme="majorBidi" w:hAnsiTheme="majorBidi" w:cstheme="majorBidi"/>
-          <w:sz w:val="28"/>
-          <w:szCs w:val="28"/>
-        </w:rPr>
-        <w:t>Appium studio, ghost inspector.</w:t>
-      </w:r>
-    </w:p>
-    <w:p>
-      <w:pPr>
-        <w:pStyle w:val="ListParagraph"/>
-        <w:numPr>
-          <w:ilvl w:val="0"/>
-          <w:numId w:val="2"/>
-        </w:numPr>
-        <w:tabs>
-          <w:tab w:val="left" w:pos="1404"/>
-        </w:tabs>
-        <w:spacing w:before="240"/>
-        <w:jc w:val="left"/>
-        <w:rPr>
-          <w:rFonts w:asciiTheme="majorBidi" w:hAnsiTheme="majorBidi" w:cstheme="majorBidi"/>
-          <w:sz w:val="28"/>
-          <w:szCs w:val="28"/>
-        </w:rPr>
-      </w:pPr>
-      <w:r>
-        <w:rPr>
-          <w:rFonts w:asciiTheme="majorBidi" w:hAnsiTheme="majorBidi" w:cstheme="majorBidi"/>
-          <w:b/>
-          <w:bCs/>
-          <w:sz w:val="28"/>
-          <w:szCs w:val="28"/>
-        </w:rPr>
-        <w:t>Databases:</w:t>
-      </w:r>
-      <w:r>
-        <w:rPr>
-          <w:rFonts w:asciiTheme="majorBidi" w:hAnsiTheme="majorBidi" w:cstheme="majorBidi"/>
-          <w:sz w:val="28"/>
-          <w:szCs w:val="28"/>
-        </w:rPr>
-        <w:t xml:space="preserve"> MySQL, PLSQL, SQLite.</w:t>
-      </w:r>
-    </w:p>
-    <w:p>
-      <w:pPr>
-        <w:pStyle w:val="ListParagraph"/>
-        <w:numPr>
-          <w:ilvl w:val="0"/>
-          <w:numId w:val="2"/>
-        </w:numPr>
-        <w:tabs>
-          <w:tab w:val="left" w:pos="1404"/>
-        </w:tabs>
-        <w:spacing w:before="240"/>
-        <w:jc w:val="left"/>
-        <w:rPr>
-          <w:rFonts w:asciiTheme="majorBidi" w:hAnsiTheme="majorBidi" w:cstheme="majorBidi"/>
-          <w:sz w:val="28"/>
-          <w:szCs w:val="28"/>
-        </w:rPr>
-      </w:pPr>
-      <w:r>
-        <w:rPr>
-          <w:rFonts w:asciiTheme="majorBidi" w:hAnsiTheme="majorBidi" w:cstheme="majorBidi"/>
-          <w:b/>
-          <w:bCs/>
-          <w:sz w:val="28"/>
-          <w:szCs w:val="28"/>
-        </w:rPr>
-        <w:t>Frameworks:</w:t>
-      </w:r>
-      <w:r>
-        <w:rPr>
-          <w:rFonts w:asciiTheme="majorBidi" w:hAnsiTheme="majorBidi" w:cstheme="majorBidi"/>
-          <w:sz w:val="28"/>
-          <w:szCs w:val="28"/>
-        </w:rPr>
-        <w:t xml:space="preserve"> </w:t>
-      </w:r>
-      <w:r>
-        <w:rPr>
-          <w:rFonts w:asciiTheme="majorBidi" w:hAnsiTheme="majorBidi" w:cstheme="majorBidi"/>
-          <w:sz w:val="28"/>
-          <w:szCs w:val="28"/>
-        </w:rPr>
-        <w:t>ASP</w:t>
-      </w:r>
-      <w:r>
-        <w:rPr>
-          <w:rFonts w:asciiTheme="majorBidi" w:hAnsiTheme="majorBidi" w:cstheme="majorBidi"/>
-          <w:sz w:val="28"/>
-          <w:szCs w:val="28"/>
-        </w:rPr>
-        <w:t>.NET</w:t>
-      </w:r>
-      <w:r>
-        <w:rPr>
-          <w:rFonts w:asciiTheme="majorBidi" w:hAnsiTheme="majorBidi" w:cstheme="majorBidi"/>
-          <w:sz w:val="28"/>
-          <w:szCs w:val="28"/>
-        </w:rPr>
-        <w:t>, Fl</w:t>
-      </w:r>
-      <w:r>
-        <w:rPr>
-          <w:rFonts w:asciiTheme="majorBidi" w:hAnsiTheme="majorBidi" w:cstheme="majorBidi"/>
-          <w:sz w:val="28"/>
-          <w:szCs w:val="28"/>
-        </w:rPr>
-        <w:t>u</w:t>
-      </w:r>
-      <w:r>
-        <w:rPr>
-          <w:rFonts w:asciiTheme="majorBidi" w:hAnsiTheme="majorBidi" w:cstheme="majorBidi"/>
-          <w:sz w:val="28"/>
-          <w:szCs w:val="28"/>
-        </w:rPr>
-        <w:t>tter</w:t>
-      </w:r>
-      <w:r>
-        <w:rPr>
-          <w:rFonts w:asciiTheme="majorBidi" w:hAnsiTheme="majorBidi" w:cstheme="majorBidi"/>
-          <w:sz w:val="28"/>
-          <w:szCs w:val="28"/>
-        </w:rPr>
-        <w:t xml:space="preserve">, </w:t>
-      </w:r>
-      <w:r>
-        <w:rPr>
-          <w:rFonts w:asciiTheme="majorBidi" w:hAnsiTheme="majorBidi" w:cstheme="majorBidi"/>
-          <w:sz w:val="28"/>
-          <w:szCs w:val="28"/>
-        </w:rPr>
-        <w:t>Bootstrap</w:t>
-      </w:r>
-      <w:r>
-        <w:rPr>
-          <w:rFonts w:asciiTheme="majorBidi" w:hAnsiTheme="majorBidi" w:cstheme="majorBidi"/>
-          <w:sz w:val="28"/>
-          <w:szCs w:val="28"/>
-        </w:rPr>
-        <w:t>.</w:t>
-      </w:r>
-    </w:p>
-    <w:p>
-      <w:pPr>
-        <w:pStyle w:val="ListParagraph"/>
-        <w:numPr>
-          <w:ilvl w:val="0"/>
-          <w:numId w:val="2"/>
-        </w:numPr>
-        <w:tabs>
-          <w:tab w:val="left" w:pos="1404"/>
-        </w:tabs>
-        <w:spacing w:before="240"/>
-        <w:jc w:val="left"/>
-        <w:rPr>
-          <w:rFonts w:asciiTheme="majorBidi" w:hAnsiTheme="majorBidi" w:cstheme="majorBidi"/>
-          <w:b/>
-          <w:bCs/>
-          <w:sz w:val="28"/>
-          <w:szCs w:val="28"/>
-        </w:rPr>
-      </w:pPr>
-      <w:r>
-        <w:rPr>
-          <w:rFonts w:asciiTheme="majorBidi" w:hAnsiTheme="majorBidi" w:cstheme="majorBidi"/>
-          <w:b/>
-          <w:bCs/>
-          <w:sz w:val="28"/>
-          <w:szCs w:val="28"/>
-        </w:rPr>
-        <w:t xml:space="preserve">Tools: </w:t>
-      </w:r>
-      <w:r>
-        <w:rPr>
-          <w:rFonts w:asciiTheme="majorBidi" w:hAnsiTheme="majorBidi" w:cstheme="majorBidi"/>
-          <w:sz w:val="28"/>
-          <w:szCs w:val="28"/>
-        </w:rPr>
-        <w:t>Jira,</w:t>
-      </w:r>
-      <w:r>
-        <w:rPr>
-          <w:rFonts w:asciiTheme="majorBidi" w:hAnsiTheme="majorBidi" w:cstheme="majorBidi"/>
-          <w:b/>
-          <w:bCs/>
-          <w:sz w:val="28"/>
-          <w:szCs w:val="28"/>
-        </w:rPr>
-        <w:t xml:space="preserve"> </w:t>
-      </w:r>
-      <w:r>
-        <w:rPr>
-          <w:rFonts w:asciiTheme="majorBidi" w:hAnsiTheme="majorBidi" w:cstheme="majorBidi"/>
-          <w:sz w:val="28"/>
-          <w:szCs w:val="28"/>
-        </w:rPr>
-        <w:t xml:space="preserve">GitHub, VirtualBox, </w:t>
-      </w:r>
-      <w:r>
-        <w:rPr>
-          <w:rFonts w:asciiTheme="majorBidi" w:hAnsiTheme="majorBidi" w:cstheme="majorBidi"/>
-          <w:sz w:val="28"/>
-          <w:szCs w:val="28"/>
-        </w:rPr>
-        <w:t>Unity</w:t>
-      </w:r>
-      <w:r>
-        <w:rPr>
-          <w:rFonts w:asciiTheme="majorBidi" w:hAnsiTheme="majorBidi" w:cstheme="majorBidi"/>
-          <w:sz w:val="28"/>
-          <w:szCs w:val="28"/>
-        </w:rPr>
-        <w:t xml:space="preserve"> Engine.</w:t>
-      </w:r>
-    </w:p>
-    <w:p>
-      <w:pPr>
-        <w:pStyle w:val="ListParagraph"/>
-        <w:numPr>
-          <w:ilvl w:val="0"/>
-          <w:numId w:val="2"/>
-        </w:numPr>
-        <w:tabs>
-          <w:tab w:val="left" w:pos="1404"/>
-        </w:tabs>
-        <w:spacing w:before="240"/>
-        <w:jc w:val="left"/>
-        <w:rPr>
-          <w:rFonts w:asciiTheme="majorBidi" w:hAnsiTheme="majorBidi" w:cstheme="majorBidi"/>
-          <w:b/>
-          <w:bCs/>
-          <w:sz w:val="28"/>
-          <w:szCs w:val="28"/>
-        </w:rPr>
-      </w:pPr>
-      <w:r>
-        <w:rPr>
-          <w:rFonts w:asciiTheme="majorBidi" w:hAnsiTheme="majorBidi" w:cstheme="majorBidi"/>
-          <w:b/>
-          <w:bCs/>
-          <w:sz w:val="28"/>
-          <w:szCs w:val="28"/>
-        </w:rPr>
-        <w:t>Other Technologies:</w:t>
-      </w:r>
-      <w:r>
-        <w:rPr>
-          <w:rFonts w:asciiTheme="majorBidi" w:hAnsiTheme="majorBidi" w:cstheme="majorBidi"/>
-          <w:sz w:val="28"/>
-          <w:szCs w:val="28"/>
-        </w:rPr>
-        <w:t xml:space="preserve"> </w:t>
-      </w:r>
-      <w:r>
-        <w:rPr>
-          <w:rFonts w:asciiTheme="majorBidi" w:hAnsiTheme="majorBidi" w:cstheme="majorBidi"/>
-          <w:sz w:val="28"/>
-          <w:szCs w:val="28"/>
-        </w:rPr>
-        <w:t>Figma,</w:t>
-      </w:r>
-      <w:r>
-        <w:rPr>
-          <w:rFonts w:asciiTheme="majorBidi" w:hAnsiTheme="majorBidi" w:cstheme="majorBidi"/>
-          <w:sz w:val="28"/>
-          <w:szCs w:val="28"/>
-        </w:rPr>
-        <w:t xml:space="preserve"> </w:t>
-      </w:r>
-      <w:r>
-        <w:rPr>
-          <w:rFonts w:asciiTheme="majorBidi" w:hAnsiTheme="majorBidi" w:cstheme="majorBidi"/>
-          <w:sz w:val="28"/>
-          <w:szCs w:val="28"/>
-        </w:rPr>
-        <w:t>Linux, Canva</w:t>
-      </w:r>
-      <w:r>
-        <w:rPr>
-          <w:rFonts w:asciiTheme="majorBidi" w:hAnsiTheme="majorBidi" w:cstheme="majorBidi"/>
-          <w:sz w:val="28"/>
-          <w:szCs w:val="28"/>
-        </w:rPr>
-        <w:t xml:space="preserve">, </w:t>
-      </w:r>
-      <w:r>
-        <w:rPr>
-          <w:rFonts w:asciiTheme="majorBidi" w:hAnsiTheme="majorBidi" w:cstheme="majorBidi"/>
-          <w:sz w:val="28"/>
-          <w:szCs w:val="28"/>
-        </w:rPr>
-        <w:t>Agile methodologies</w:t>
-      </w:r>
-      <w:r>
-        <w:rPr>
-          <w:rFonts w:asciiTheme="majorBidi" w:hAnsiTheme="majorBidi" w:cstheme="majorBidi"/>
           <w:sz w:val="28"/>
           <w:szCs w:val="28"/>
         </w:rPr>
@@ -1785,30 +1644,84 @@
 <file path=word/numbering.xml><?xml version="1.0" encoding="utf-8"?>
 <w:numbering xmlns:wpc="http://schemas.microsoft.com/office/word/2010/wordprocessingCanvas" xmlns:cx="http://schemas.microsoft.com/office/drawing/2014/chartex" xmlns:cx1="http://schemas.microsoft.com/office/drawing/2015/9/8/chartex" xmlns:cx2="http://schemas.microsoft.com/office/drawing/2015/10/21/chartex" xmlns:cx3="http://schemas.microsoft.com/office/drawing/2016/5/9/chartex" xmlns:cx4="http://schemas.microsoft.com/office/drawing/2016/5/10/chartex" xmlns:cx5="http://schemas.microsoft.com/office/drawing/2016/5/11/chartex" xmlns:cx6="http://schemas.microsoft.com/office/drawing/2016/5/12/chartex" xmlns:cx7="http://schemas.microsoft.com/office/drawing/2016/5/13/chartex" xmlns:cx8="http://schemas.microsoft.com/office/drawing/2016/5/14/chartex" xmlns:mc="http://schemas.openxmlformats.org/markup-compatibility/2006" xmlns:aink="http://schemas.microsoft.com/office/drawing/2016/ink" xmlns:am3d="http://schemas.microsoft.com/office/drawing/2017/model3d" xmlns:o="urn:schemas-microsoft-com:office:office" xmlns:oel="http://schemas.microsoft.com/office/2019/extlst" xmlns:r="http://schemas.openxmlformats.org/officeDocument/2006/relationships" xmlns:m="http://schemas.openxmlformats.org/officeDocument/2006/math" xmlns:v="urn:schemas-microsoft-com:vml" xmlns:wp14="http://schemas.microsoft.com/office/word/2010/wordprocessingDrawing" xmlns:wp="http://schemas.openxmlformats.org/drawingml/2006/wordprocessingDrawing" xmlns:w10="urn:schemas-microsoft-com:office:word" xmlns:w="http://schemas.openxmlformats.org/wordprocessingml/2006/main" xmlns:w14="http://schemas.microsoft.com/office/word/2010/wordml" xmlns:w15="http://schemas.microsoft.com/office/word/2012/wordml" xmlns:w16cex="http://schemas.microsoft.com/office/word/2018/wordml/cex" xmlns:w16cid="http://schemas.microsoft.com/office/word/2016/wordml/cid" xmlns:w16="http://schemas.microsoft.com/office/word/2018/wordml" xmlns:w16du="http://schemas.microsoft.com/office/word/2023/wordml/word16du" xmlns:w16sdtdh="http://schemas.microsoft.com/office/word/2020/wordml/sdtdatahash" xmlns:w16sdtfl="http://schemas.microsoft.com/office/word/2024/wordml/sdtformatlock" xmlns:w16se="http://schemas.microsoft.com/office/word/2015/wordml/symex" xmlns:wpg="http://schemas.microsoft.com/office/word/2010/wordprocessingGroup" xmlns:wpi="http://schemas.microsoft.com/office/word/2010/wordprocessingInk" xmlns:wne="http://schemas.microsoft.com/office/word/2006/wordml" xmlns:wps="http://schemas.microsoft.com/office/word/2010/wordprocessingShape" mc:Ignorable="w14 w15 w16se w16cid w16 w16cex w16sdtdh w16sdtfl w16du wp14">
   <w:numPicBullet w:numPicBulletId="0">
-    <w:pict>
-      <v:shapetype id="_x0000_t75" coordsize="21600,21600" o:spt="75" o:preferrelative="t" path="m@4@5l@4@11@9@11@9@5xe" filled="f" stroked="f">
-        <v:stroke joinstyle="miter"/>
-        <v:formulas>
-          <v:f eqn="if lineDrawn pixelLineWidth 0"/>
-          <v:f eqn="sum @0 1 0"/>
-          <v:f eqn="sum 0 0 @1"/>
-          <v:f eqn="prod @2 1 2"/>
-          <v:f eqn="prod @3 21600 pixelWidth"/>
-          <v:f eqn="prod @3 21600 pixelHeight"/>
-          <v:f eqn="sum @0 0 1"/>
-          <v:f eqn="prod @6 1 2"/>
-          <v:f eqn="prod @7 21600 pixelWidth"/>
-          <v:f eqn="sum @8 21600 0"/>
-          <v:f eqn="prod @7 21600 pixelHeight"/>
-          <v:f eqn="sum @10 21600 0"/>
-        </v:formulas>
-        <v:path o:extrusionok="f" gradientshapeok="t" o:connecttype="rect"/>
-        <o:lock v:ext="edit" aspectratio="t"/>
-      </v:shapetype>
-      <v:shape id="_x0000_i1035" type="#_x0000_t75" alt="Envelope outline" style="width:19.8pt;height:15pt;visibility:visible" o:gfxdata="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" o:bullet="t">
-        <v:imagedata r:id="rId1" o:title="" croptop="-14734f" cropbottom="-14734f" cropleft="-3160f" cropright="-3160f"/>
-      </v:shape>
-    </w:pict>
+    <mc:AlternateContent>
+      <mc:Choice Requires="v">
+        <w:pict>
+          <v:shapetype w14:anchorId="55F1614C" id="_x0000_t75" coordsize="21600,21600" o:spt="75" o:preferrelative="t" path="m@4@5l@4@11@9@11@9@5xe" filled="f" stroked="f">
+            <v:stroke joinstyle="miter"/>
+            <v:formulas>
+              <v:f eqn="if lineDrawn pixelLineWidth 0"/>
+              <v:f eqn="sum @0 1 0"/>
+              <v:f eqn="sum 0 0 @1"/>
+              <v:f eqn="prod @2 1 2"/>
+              <v:f eqn="prod @3 21600 pixelWidth"/>
+              <v:f eqn="prod @3 21600 pixelHeight"/>
+              <v:f eqn="sum @0 0 1"/>
+              <v:f eqn="prod @6 1 2"/>
+              <v:f eqn="prod @7 21600 pixelWidth"/>
+              <v:f eqn="sum @8 21600 0"/>
+              <v:f eqn="prod @7 21600 pixelHeight"/>
+              <v:f eqn="sum @10 21600 0"/>
+            </v:formulas>
+            <v:path o:extrusionok="f" gradientshapeok="t" o:connecttype="rect"/>
+            <o:lock v:ext="edit" aspectratio="t"/>
+          </v:shapetype>
+          <v:shape id="Picture 441020022" o:spid="_x0000_i1025" type="#_x0000_t75" alt="Envelope outline" style="width:19.8pt;height:15pt;visibility:visible;mso-wrap-style:square">
+            <v:imagedata r:id="rId1" o:title="Envelope outline" croptop="-14734f" cropbottom="-14734f" cropleft="-3160f" cropright="-3160f"/>
+          </v:shape>
+        </w:pict>
+      </mc:Choice>
+      <mc:Fallback>
+        <w:drawing>
+          <wp:inline distT="0" distB="0" distL="0" distR="0" wp14:anchorId="0039301E" wp14:editId="2CF7B243">
+            <wp:extent cx="251460" cy="190500"/>
+            <wp:effectExtent l="0" t="0" r="0" b="0"/>
+            <wp:docPr id="441020022" name="Picture 441020022" descr="Envelope outline"/>
+            <wp:cNvGraphicFramePr>
+              <a:graphicFrameLocks xmlns:a="http://schemas.openxmlformats.org/drawingml/2006/main" noChangeAspect="1"/>
+            </wp:cNvGraphicFramePr>
+            <a:graphic xmlns:a="http://schemas.openxmlformats.org/drawingml/2006/main">
+              <a:graphicData uri="http://schemas.openxmlformats.org/drawingml/2006/picture">
+                <pic:pic xmlns:pic="http://schemas.openxmlformats.org/drawingml/2006/picture">
+                  <pic:nvPicPr>
+                    <pic:cNvPr id="0" name="Picture -1023" descr="Envelope outline"/>
+                    <pic:cNvPicPr>
+                      <a:picLocks noChangeAspect="1" noChangeArrowheads="1"/>
+                    </pic:cNvPicPr>
+                  </pic:nvPicPr>
+                  <pic:blipFill>
+                    <a:blip r:embed="rId2">
+                      <a:extLst>
+                        <a:ext uri="{28A0092B-C50C-407E-A947-70E740481C1C}">
+                          <a14:useLocalDpi xmlns:a14="http://schemas.microsoft.com/office/drawing/2010/main" val="0"/>
+                        </a:ext>
+                      </a:extLst>
+                    </a:blip>
+                    <a:srcRect l="-4822" t="-22482" r="-4822" b="-22482"/>
+                    <a:stretch>
+                      <a:fillRect/>
+                    </a:stretch>
+                  </pic:blipFill>
+                  <pic:spPr bwMode="auto">
+                    <a:xfrm>
+                      <a:off x="0" y="0"/>
+                      <a:ext cx="251460" cy="190500"/>
+                    </a:xfrm>
+                    <a:prstGeom prst="rect">
+                      <a:avLst/>
+                    </a:prstGeom>
+                    <a:noFill/>
+                    <a:ln>
+                      <a:noFill/>
+                    </a:ln>
+                  </pic:spPr>
+                </pic:pic>
+              </a:graphicData>
+            </a:graphic>
+          </wp:inline>
+        </w:drawing>
+      </mc:Fallback>
+    </mc:AlternateContent>
   </w:numPicBullet>
   <w:abstractNum w:abstractNumId="0" w15:restartNumberingAfterBreak="0">
     <w:nsid w:val="0B7D67DC"/>

</xml_diff>